<commit_message>
Upload “src/content/bios/De Larosière-JMHM 2016.docx”
</commit_message>
<xml_diff>
--- a/src/content/bios/De Larosière-JMHM 2016.docx
+++ b/src/content/bios/De Larosière-JMHM 2016.docx
@@ -1,6 +1,6 @@
 
 <file path=word/document.xml><?xml version="1.0" encoding="utf-8"?>
-<w:document xmlns:wpc="http://schemas.microsoft.com/office/word/2010/wordprocessingCanvas" xmlns:cx="http://schemas.microsoft.com/office/drawing/2014/chartex" xmlns:cx1="http://schemas.microsoft.com/office/drawing/2015/9/8/chartex" xmlns:cx2="http://schemas.microsoft.com/office/drawing/2015/10/21/chartex" xmlns:cx3="http://schemas.microsoft.com/office/drawing/2016/5/9/chartex" xmlns:cx4="http://schemas.microsoft.com/office/drawing/2016/5/10/chartex" xmlns:cx5="http://schemas.microsoft.com/office/drawing/2016/5/11/chartex" xmlns:cx6="http://schemas.microsoft.com/office/drawing/2016/5/12/chartex" xmlns:cx7="http://schemas.microsoft.com/office/drawing/2016/5/13/chartex" xmlns:cx8="http://schemas.microsoft.com/office/drawing/2016/5/14/chartex" xmlns:mc="http://schemas.openxmlformats.org/markup-compatibility/2006" xmlns:aink="http://schemas.microsoft.com/office/drawing/2016/ink" xmlns:am3d="http://schemas.microsoft.com/office/drawing/2017/model3d" xmlns:o="urn:schemas-microsoft-com:office:office" xmlns:oel="http://schemas.microsoft.com/office/2019/extlst" xmlns:r="http://schemas.openxmlformats.org/officeDocument/2006/relationships" xmlns:m="http://schemas.openxmlformats.org/officeDocument/2006/math" xmlns:v="urn:schemas-microsoft-com:vml" xmlns:wp14="http://schemas.microsoft.com/office/word/2010/wordprocessingDrawing" xmlns:wp="http://schemas.openxmlformats.org/drawingml/2006/wordprocessingDrawing" xmlns:w10="urn:schemas-microsoft-com:office:word" xmlns:w="http://schemas.openxmlformats.org/wordprocessingml/2006/main" xmlns:w14="http://schemas.microsoft.com/office/word/2010/wordml" xmlns:w15="http://schemas.microsoft.com/office/word/2012/wordml" xmlns:w16cex="http://schemas.microsoft.com/office/word/2018/wordml/cex" xmlns:w16cid="http://schemas.microsoft.com/office/word/2016/wordml/cid" xmlns:w16="http://schemas.microsoft.com/office/word/2018/wordml" xmlns:w16du="http://schemas.microsoft.com/office/word/2023/wordml/word16du" xmlns:w16sdtdh="http://schemas.microsoft.com/office/word/2020/wordml/sdtdatahash" xmlns:w16sdtfl="http://schemas.microsoft.com/office/word/2024/wordml/sdtformatlock" xmlns:w16se="http://schemas.microsoft.com/office/word/2015/wordml/symex" xmlns:wpg="http://schemas.microsoft.com/office/word/2010/wordprocessingGroup" xmlns:wpi="http://schemas.microsoft.com/office/word/2010/wordprocessingInk" xmlns:wne="http://schemas.microsoft.com/office/word/2006/wordml" xmlns:wps="http://schemas.microsoft.com/office/word/2010/wordprocessingShape" mc:Ignorable="w14 w15 w16se w16cid w16 w16cex w16sdtdh w16sdtfl w16du wp14">
+<w:document xmlns:wpc="http://schemas.microsoft.com/office/word/2010/wordprocessingCanvas" xmlns:cx="http://schemas.microsoft.com/office/drawing/2014/chartex" xmlns:cx1="http://schemas.microsoft.com/office/drawing/2015/9/8/chartex" xmlns:cx2="http://schemas.microsoft.com/office/drawing/2015/10/21/chartex" xmlns:cx3="http://schemas.microsoft.com/office/drawing/2016/5/9/chartex" xmlns:cx4="http://schemas.microsoft.com/office/drawing/2016/5/10/chartex" xmlns:cx5="http://schemas.microsoft.com/office/drawing/2016/5/11/chartex" xmlns:cx6="http://schemas.microsoft.com/office/drawing/2016/5/12/chartex" xmlns:cx7="http://schemas.microsoft.com/office/drawing/2016/5/13/chartex" xmlns:cx8="http://schemas.microsoft.com/office/drawing/2016/5/14/chartex" xmlns:mc="http://schemas.openxmlformats.org/markup-compatibility/2006" xmlns:m="http://schemas.openxmlformats.org/officeDocument/2006/math" xmlns:aink="http://schemas.microsoft.com/office/drawing/2016/ink" xmlns:am3d="http://schemas.microsoft.com/office/drawing/2017/model3d" xmlns:oel="http://schemas.microsoft.com/office/2019/extlst" xmlns:r="http://schemas.openxmlformats.org/officeDocument/2006/relationships" xmlns:wp14="http://schemas.microsoft.com/office/word/2010/wordprocessingDrawing" xmlns:wp="http://schemas.openxmlformats.org/drawingml/2006/wordprocessingDrawing" xmlns:wpg="http://schemas.microsoft.com/office/word/2010/wordprocessingGroup" xmlns:wpi="http://schemas.microsoft.com/office/word/2010/wordprocessingInk" xmlns:wps="http://schemas.microsoft.com/office/word/2010/wordprocessingShape" xmlns:o="urn:schemas-microsoft-com:office:office" xmlns:v="urn:schemas-microsoft-com:vml" xmlns:w10="urn:schemas-microsoft-com:office:word" xmlns:w="http://schemas.openxmlformats.org/wordprocessingml/2006/main" xmlns:w14="http://schemas.microsoft.com/office/word/2010/wordml" xmlns:w15="http://schemas.microsoft.com/office/word/2012/wordml" xmlns:w16cei="http://schemas.microsoft.com/office/word/2026/wordml/cei" xmlns:w16cex="http://schemas.microsoft.com/office/word/2018/wordml/cex" xmlns:w16cid="http://schemas.microsoft.com/office/word/2016/wordml/cid" xmlns:w16="http://schemas.microsoft.com/office/word/2018/wordml" xmlns:w16sdtdh="http://schemas.microsoft.com/office/word/2020/wordml/sdtdatahash" xmlns:w16sdtfl="http://schemas.microsoft.com/office/word/2024/wordml/sdtformatlock" xmlns:w16se="http://schemas.microsoft.com/office/word/2015/wordml/symex" xmlns:w16du="http://schemas.microsoft.com/office/word/2023/wordml/word16du" xmlns:wne="http://schemas.microsoft.com/office/word/2006/wordml" mc:Ignorable="w14 w15 w16se w16cid w16 w16cex w16sdtdh w16sdtfl w16du wp14">
   <w:body>
     <w:p>
       <w:pPr>
@@ -122,7 +122,51 @@
           <w:sz w:val="24"/>
           <w:szCs w:val="24"/>
         </w:rPr>
-        <w:t xml:space="preserve"> Hugayte de Champfeu. </w:t>
+        <w:t xml:space="preserve"> </w:t>
+      </w:r>
+      <w:proofErr w:type="spellStart"/>
+      <w:r>
+        <w:rPr>
+          <w:rFonts w:ascii="Times New Roman" w:hAnsi="Times New Roman" w:cs="Times New Roman"/>
+          <w:b/>
+          <w:bCs/>
+          <w:sz w:val="24"/>
+          <w:szCs w:val="24"/>
+        </w:rPr>
+        <w:t>Hugayte</w:t>
+      </w:r>
+      <w:proofErr w:type="spellEnd"/>
+      <w:r>
+        <w:rPr>
+          <w:rFonts w:ascii="Times New Roman" w:hAnsi="Times New Roman" w:cs="Times New Roman"/>
+          <w:b/>
+          <w:bCs/>
+          <w:sz w:val="24"/>
+          <w:szCs w:val="24"/>
+        </w:rPr>
+        <w:t xml:space="preserve"> de </w:t>
+      </w:r>
+      <w:proofErr w:type="spellStart"/>
+      <w:r>
+        <w:rPr>
+          <w:rFonts w:ascii="Times New Roman" w:hAnsi="Times New Roman" w:cs="Times New Roman"/>
+          <w:b/>
+          <w:bCs/>
+          <w:sz w:val="24"/>
+          <w:szCs w:val="24"/>
+        </w:rPr>
+        <w:t>Champfeu</w:t>
+      </w:r>
+      <w:proofErr w:type="spellEnd"/>
+      <w:r>
+        <w:rPr>
+          <w:rFonts w:ascii="Times New Roman" w:hAnsi="Times New Roman" w:cs="Times New Roman"/>
+          <w:b/>
+          <w:bCs/>
+          <w:sz w:val="24"/>
+          <w:szCs w:val="24"/>
+        </w:rPr>
+        <w:t xml:space="preserve">. </w:t>
       </w:r>
       <w:r>
         <w:rPr>
@@ -213,8 +257,9 @@
           <w:sz w:val="24"/>
           <w:szCs w:val="24"/>
         </w:rPr>
-        <w:t xml:space="preserve">‘de Champfeu’ </w:t>
-      </w:r>
+        <w:t xml:space="preserve">‘de </w:t>
+      </w:r>
+      <w:proofErr w:type="spellStart"/>
       <w:r>
         <w:rPr>
           <w:rFonts w:ascii="Times New Roman" w:hAnsi="Times New Roman" w:cs="Times New Roman"/>
@@ -222,6 +267,25 @@
           <w:sz w:val="24"/>
           <w:szCs w:val="24"/>
         </w:rPr>
+        <w:t>Champfeu</w:t>
+      </w:r>
+      <w:proofErr w:type="spellEnd"/>
+      <w:r>
+        <w:rPr>
+          <w:rFonts w:ascii="Times New Roman" w:hAnsi="Times New Roman" w:cs="Times New Roman"/>
+          <w:b/>
+          <w:sz w:val="24"/>
+          <w:szCs w:val="24"/>
+        </w:rPr>
+        <w:t xml:space="preserve">’ </w:t>
+      </w:r>
+      <w:r>
+        <w:rPr>
+          <w:rFonts w:ascii="Times New Roman" w:hAnsi="Times New Roman" w:cs="Times New Roman"/>
+          <w:b/>
+          <w:sz w:val="24"/>
+          <w:szCs w:val="24"/>
+        </w:rPr>
         <w:t xml:space="preserve">is added </w:t>
       </w:r>
       <w:r>
@@ -267,7 +331,27 @@
           <w:sz w:val="24"/>
           <w:szCs w:val="24"/>
         </w:rPr>
-        <w:t xml:space="preserve"> his mother who came from a noble family in the Bourbon line.</w:t>
+        <w:t xml:space="preserve"> his mother who came from a noble family in the </w:t>
+      </w:r>
+      <w:proofErr w:type="gramStart"/>
+      <w:r>
+        <w:rPr>
+          <w:rFonts w:ascii="Times New Roman" w:hAnsi="Times New Roman" w:cs="Times New Roman"/>
+          <w:b/>
+          <w:sz w:val="24"/>
+          <w:szCs w:val="24"/>
+        </w:rPr>
+        <w:t>Bourbon</w:t>
+      </w:r>
+      <w:proofErr w:type="gramEnd"/>
+      <w:r>
+        <w:rPr>
+          <w:rFonts w:ascii="Times New Roman" w:hAnsi="Times New Roman" w:cs="Times New Roman"/>
+          <w:b/>
+          <w:sz w:val="24"/>
+          <w:szCs w:val="24"/>
+        </w:rPr>
+        <w:t xml:space="preserve"> line.</w:t>
       </w:r>
     </w:p>
     <w:p>
@@ -299,13 +383,12 @@
           <w:noProof/>
           <w:sz w:val="24"/>
           <w:szCs w:val="24"/>
-          <w:lang w:eastAsia="nl-NL"/>
         </w:rPr>
         <w:drawing>
-          <wp:inline distT="0" distB="0" distL="0" distR="0" wp14:anchorId="0C897E33" wp14:editId="294206A0">
-            <wp:extent cx="1742449" cy="2257425"/>
-            <wp:effectExtent l="0" t="0" r="0" b="3175"/>
-            <wp:docPr id="2" name="Afbeelding 2"/>
+          <wp:inline distT="0" distB="0" distL="0" distR="0" wp14:anchorId="0216DEA2" wp14:editId="46CE007A">
+            <wp:extent cx="1955615" cy="2526003"/>
+            <wp:effectExtent l="0" t="0" r="635" b="1905"/>
+            <wp:docPr id="1407854753" name="Afbeelding 1"/>
             <wp:cNvGraphicFramePr>
               <a:graphicFrameLocks xmlns:a="http://schemas.openxmlformats.org/drawingml/2006/main" noChangeAspect="1"/>
             </wp:cNvGraphicFramePr>
@@ -313,33 +396,29 @@
               <a:graphicData uri="http://schemas.openxmlformats.org/drawingml/2006/picture">
                 <pic:pic xmlns:pic="http://schemas.openxmlformats.org/drawingml/2006/picture">
                   <pic:nvPicPr>
-                    <pic:cNvPr id="0" name="Picture 2"/>
-                    <pic:cNvPicPr>
-                      <a:picLocks noChangeAspect="1" noChangeArrowheads="1"/>
-                    </pic:cNvPicPr>
+                    <pic:cNvPr id="1407854753" name="Afbeelding 1407854753"/>
+                    <pic:cNvPicPr/>
                   </pic:nvPicPr>
                   <pic:blipFill>
-                    <a:blip r:embed="rId6"/>
-                    <a:srcRect/>
+                    <a:blip r:embed="rId6" cstate="print">
+                      <a:extLst>
+                        <a:ext uri="{28A0092B-C50C-407E-A947-70E740481C1C}">
+                          <a14:useLocalDpi xmlns:a14="http://schemas.microsoft.com/office/drawing/2010/main" val="0"/>
+                        </a:ext>
+                      </a:extLst>
+                    </a:blip>
                     <a:stretch>
                       <a:fillRect/>
                     </a:stretch>
                   </pic:blipFill>
-                  <pic:spPr bwMode="auto">
+                  <pic:spPr>
                     <a:xfrm>
                       <a:off x="0" y="0"/>
-                      <a:ext cx="1765790" cy="2287665"/>
+                      <a:ext cx="1983893" cy="2562529"/>
                     </a:xfrm>
                     <a:prstGeom prst="rect">
                       <a:avLst/>
                     </a:prstGeom>
-                    <a:noFill/>
-                    <a:ln w="9525">
-                      <a:noFill/>
-                      <a:miter lim="800000"/>
-                      <a:headEnd/>
-                      <a:tailEnd/>
-                    </a:ln>
                   </pic:spPr>
                 </pic:pic>
               </a:graphicData>
@@ -359,6 +438,7 @@
           <w:lang w:val="fr-FR"/>
         </w:rPr>
       </w:pPr>
+      <w:proofErr w:type="gramStart"/>
       <w:r>
         <w:rPr>
           <w:rFonts w:ascii="Times New Roman" w:hAnsi="Times New Roman" w:cs="Times New Roman"/>
@@ -366,21 +446,9 @@
           <w:szCs w:val="24"/>
           <w:lang w:val="fr-FR"/>
         </w:rPr>
-        <w:t xml:space="preserve">Source: </w:t>
-      </w:r>
-      <w:hyperlink r:id="rId7" w:history="1">
-        <w:r>
-          <w:rPr>
-            <w:rStyle w:val="Hyperlink"/>
-            <w:rFonts w:ascii="Times New Roman" w:hAnsi="Times New Roman" w:cs="Times New Roman"/>
-            <w:sz w:val="24"/>
-            <w:szCs w:val="24"/>
-            <w:u w:val="none"/>
-            <w:lang w:val="fr-FR"/>
-          </w:rPr>
-          <w:t>www.flickr.com/photos/imfphoto/5881758615/in/album-72157618982450078/</w:t>
-        </w:r>
-      </w:hyperlink>
+        <w:t>Source:</w:t>
+      </w:r>
+      <w:proofErr w:type="gramEnd"/>
       <w:r>
         <w:rPr>
           <w:rFonts w:ascii="Times New Roman" w:hAnsi="Times New Roman" w:cs="Times New Roman"/>
@@ -389,6 +457,35 @@
           <w:lang w:val="fr-FR"/>
         </w:rPr>
         <w:t xml:space="preserve"> </w:t>
+      </w:r>
+      <w:r>
+        <w:rPr>
+          <w:rFonts w:ascii="Times New Roman" w:hAnsi="Times New Roman" w:cs="Times New Roman"/>
+          <w:sz w:val="24"/>
+          <w:szCs w:val="24"/>
+          <w:lang w:val="en-GB"/>
+        </w:rPr>
+        <w:t xml:space="preserve">De </w:t>
+      </w:r>
+      <w:proofErr w:type="spellStart"/>
+      <w:r>
+        <w:rPr>
+          <w:rFonts w:ascii="Times New Roman" w:hAnsi="Times New Roman" w:cs="Times New Roman"/>
+          <w:sz w:val="24"/>
+          <w:szCs w:val="24"/>
+          <w:lang w:val="en-GB"/>
+        </w:rPr>
+        <w:t>Larosière</w:t>
+      </w:r>
+      <w:proofErr w:type="spellEnd"/>
+      <w:r>
+        <w:rPr>
+          <w:rFonts w:ascii="Times New Roman" w:hAnsi="Times New Roman" w:cs="Times New Roman"/>
+          <w:sz w:val="24"/>
+          <w:szCs w:val="24"/>
+          <w:lang w:val="en-GB"/>
+        </w:rPr>
+        <w:t xml:space="preserve"> at the IMF, n.d., Flickr</w:t>
       </w:r>
     </w:p>
     <w:p>
@@ -426,7 +523,25 @@
           <w:sz w:val="24"/>
           <w:szCs w:val="24"/>
         </w:rPr>
-        <w:t>e Larosière was raised in comfortable circumstances in Paris to parents who</w:t>
+        <w:t xml:space="preserve">e </w:t>
+      </w:r>
+      <w:proofErr w:type="spellStart"/>
+      <w:r>
+        <w:rPr>
+          <w:rFonts w:ascii="Times New Roman" w:hAnsi="Times New Roman" w:cs="Times New Roman"/>
+          <w:sz w:val="24"/>
+          <w:szCs w:val="24"/>
+        </w:rPr>
+        <w:t>Larosière</w:t>
+      </w:r>
+      <w:proofErr w:type="spellEnd"/>
+      <w:r>
+        <w:rPr>
+          <w:rFonts w:ascii="Times New Roman" w:hAnsi="Times New Roman" w:cs="Times New Roman"/>
+          <w:sz w:val="24"/>
+          <w:szCs w:val="24"/>
+        </w:rPr>
+        <w:t xml:space="preserve"> was raised in comfortable circumstances in Paris to parents who</w:t>
       </w:r>
       <w:r>
         <w:rPr>
@@ -682,7 +797,25 @@
           <w:sz w:val="24"/>
           <w:szCs w:val="24"/>
         </w:rPr>
-        <w:t>(IEP, Institut des études</w:t>
+        <w:t xml:space="preserve">(IEP, </w:t>
+      </w:r>
+      <w:proofErr w:type="spellStart"/>
+      <w:r>
+        <w:rPr>
+          <w:rFonts w:ascii="Times New Roman" w:hAnsi="Times New Roman" w:cs="Times New Roman"/>
+          <w:sz w:val="24"/>
+          <w:szCs w:val="24"/>
+        </w:rPr>
+        <w:t>Institut</w:t>
+      </w:r>
+      <w:proofErr w:type="spellEnd"/>
+      <w:r>
+        <w:rPr>
+          <w:rFonts w:ascii="Times New Roman" w:hAnsi="Times New Roman" w:cs="Times New Roman"/>
+          <w:sz w:val="24"/>
+          <w:szCs w:val="24"/>
+        </w:rPr>
+        <w:t xml:space="preserve"> des études</w:t>
       </w:r>
       <w:r>
         <w:rPr>
@@ -778,8 +911,36 @@
           <w:sz w:val="24"/>
           <w:szCs w:val="24"/>
         </w:rPr>
-        <w:t>cole nationale d’administration</w:t>
-      </w:r>
+        <w:t xml:space="preserve">cole </w:t>
+      </w:r>
+      <w:proofErr w:type="spellStart"/>
+      <w:r>
+        <w:rPr>
+          <w:rFonts w:ascii="Times New Roman" w:hAnsi="Times New Roman" w:cs="Times New Roman"/>
+          <w:sz w:val="24"/>
+          <w:szCs w:val="24"/>
+        </w:rPr>
+        <w:t>nationale</w:t>
+      </w:r>
+      <w:proofErr w:type="spellEnd"/>
+      <w:r>
+        <w:rPr>
+          <w:rFonts w:ascii="Times New Roman" w:hAnsi="Times New Roman" w:cs="Times New Roman"/>
+          <w:sz w:val="24"/>
+          <w:szCs w:val="24"/>
+        </w:rPr>
+        <w:t xml:space="preserve"> </w:t>
+      </w:r>
+      <w:proofErr w:type="spellStart"/>
+      <w:r>
+        <w:rPr>
+          <w:rFonts w:ascii="Times New Roman" w:hAnsi="Times New Roman" w:cs="Times New Roman"/>
+          <w:sz w:val="24"/>
+          <w:szCs w:val="24"/>
+        </w:rPr>
+        <w:t>d’administration</w:t>
+      </w:r>
+      <w:proofErr w:type="spellEnd"/>
       <w:r>
         <w:rPr>
           <w:rFonts w:ascii="Times New Roman" w:hAnsi="Times New Roman" w:cs="Times New Roman"/>
@@ -1162,7 +1323,25 @@
           <w:sz w:val="24"/>
           <w:szCs w:val="24"/>
         </w:rPr>
-        <w:t xml:space="preserve">De Larosière </w:t>
+        <w:t xml:space="preserve">De </w:t>
+      </w:r>
+      <w:proofErr w:type="spellStart"/>
+      <w:r>
+        <w:rPr>
+          <w:rFonts w:ascii="Times New Roman" w:hAnsi="Times New Roman" w:cs="Times New Roman"/>
+          <w:sz w:val="24"/>
+          <w:szCs w:val="24"/>
+        </w:rPr>
+        <w:t>Larosière</w:t>
+      </w:r>
+      <w:proofErr w:type="spellEnd"/>
+      <w:r>
+        <w:rPr>
+          <w:rFonts w:ascii="Times New Roman" w:hAnsi="Times New Roman" w:cs="Times New Roman"/>
+          <w:sz w:val="24"/>
+          <w:szCs w:val="24"/>
+        </w:rPr>
+        <w:t xml:space="preserve"> </w:t>
       </w:r>
       <w:r>
         <w:rPr>
@@ -1234,15 +1413,33 @@
           <w:sz w:val="24"/>
           <w:szCs w:val="24"/>
         </w:rPr>
-        <w:t xml:space="preserve"> Review Committee of the Organis</w:t>
-      </w:r>
-      <w:r>
-        <w:rPr>
-          <w:rFonts w:ascii="Times New Roman" w:hAnsi="Times New Roman" w:cs="Times New Roman"/>
-          <w:sz w:val="24"/>
-          <w:szCs w:val="24"/>
-        </w:rPr>
-        <w:t>ation for Economic Cooperation and Development.</w:t>
+        <w:t xml:space="preserve"> Review Committee of the </w:t>
+      </w:r>
+      <w:proofErr w:type="spellStart"/>
+      <w:r>
+        <w:rPr>
+          <w:rFonts w:ascii="Times New Roman" w:hAnsi="Times New Roman" w:cs="Times New Roman"/>
+          <w:sz w:val="24"/>
+          <w:szCs w:val="24"/>
+        </w:rPr>
+        <w:t>Organis</w:t>
+      </w:r>
+      <w:r>
+        <w:rPr>
+          <w:rFonts w:ascii="Times New Roman" w:hAnsi="Times New Roman" w:cs="Times New Roman"/>
+          <w:sz w:val="24"/>
+          <w:szCs w:val="24"/>
+        </w:rPr>
+        <w:t>ation</w:t>
+      </w:r>
+      <w:proofErr w:type="spellEnd"/>
+      <w:r>
+        <w:rPr>
+          <w:rFonts w:ascii="Times New Roman" w:hAnsi="Times New Roman" w:cs="Times New Roman"/>
+          <w:sz w:val="24"/>
+          <w:szCs w:val="24"/>
+        </w:rPr>
+        <w:t xml:space="preserve"> for Economic Cooperation and Development.</w:t>
       </w:r>
       <w:r>
         <w:rPr>
@@ -1398,7 +1595,25 @@
           <w:sz w:val="24"/>
           <w:szCs w:val="24"/>
         </w:rPr>
-        <w:t xml:space="preserve"> De Larosière </w:t>
+        <w:t xml:space="preserve"> De </w:t>
+      </w:r>
+      <w:proofErr w:type="spellStart"/>
+      <w:r>
+        <w:rPr>
+          <w:rFonts w:ascii="Times New Roman" w:hAnsi="Times New Roman" w:cs="Times New Roman"/>
+          <w:sz w:val="24"/>
+          <w:szCs w:val="24"/>
+        </w:rPr>
+        <w:t>Larosière</w:t>
+      </w:r>
+      <w:proofErr w:type="spellEnd"/>
+      <w:r>
+        <w:rPr>
+          <w:rFonts w:ascii="Times New Roman" w:hAnsi="Times New Roman" w:cs="Times New Roman"/>
+          <w:sz w:val="24"/>
+          <w:szCs w:val="24"/>
+        </w:rPr>
+        <w:t xml:space="preserve"> </w:t>
       </w:r>
       <w:r>
         <w:rPr>
@@ -1558,7 +1773,25 @@
           <w:sz w:val="24"/>
           <w:szCs w:val="24"/>
         </w:rPr>
-        <w:t xml:space="preserve">As a member of the French delegation he helped </w:t>
+        <w:t xml:space="preserve">As a member of the French </w:t>
+      </w:r>
+      <w:proofErr w:type="gramStart"/>
+      <w:r>
+        <w:rPr>
+          <w:rFonts w:ascii="Times New Roman" w:hAnsi="Times New Roman" w:cs="Times New Roman"/>
+          <w:sz w:val="24"/>
+          <w:szCs w:val="24"/>
+        </w:rPr>
+        <w:t>delegation</w:t>
+      </w:r>
+      <w:proofErr w:type="gramEnd"/>
+      <w:r>
+        <w:rPr>
+          <w:rFonts w:ascii="Times New Roman" w:hAnsi="Times New Roman" w:cs="Times New Roman"/>
+          <w:sz w:val="24"/>
+          <w:szCs w:val="24"/>
+        </w:rPr>
+        <w:t xml:space="preserve"> he helped </w:t>
       </w:r>
       <w:r>
         <w:rPr>
@@ -1654,7 +1887,25 @@
           <w:sz w:val="24"/>
           <w:szCs w:val="24"/>
         </w:rPr>
-        <w:t xml:space="preserve">De Larosière </w:t>
+        <w:t xml:space="preserve">De </w:t>
+      </w:r>
+      <w:proofErr w:type="spellStart"/>
+      <w:r>
+        <w:rPr>
+          <w:rFonts w:ascii="Times New Roman" w:hAnsi="Times New Roman" w:cs="Times New Roman"/>
+          <w:sz w:val="24"/>
+          <w:szCs w:val="24"/>
+        </w:rPr>
+        <w:t>Larosière</w:t>
+      </w:r>
+      <w:proofErr w:type="spellEnd"/>
+      <w:r>
+        <w:rPr>
+          <w:rFonts w:ascii="Times New Roman" w:hAnsi="Times New Roman" w:cs="Times New Roman"/>
+          <w:sz w:val="24"/>
+          <w:szCs w:val="24"/>
+        </w:rPr>
+        <w:t xml:space="preserve"> </w:t>
       </w:r>
       <w:r>
         <w:rPr>
@@ -1678,15 +1929,7 @@
           <w:sz w:val="24"/>
           <w:szCs w:val="24"/>
         </w:rPr>
-        <w:t xml:space="preserve"> and Director of the Treasury before Giscard d’Estaing was elected President of France in May 1974</w:t>
-      </w:r>
-      <w:r>
-        <w:rPr>
-          <w:rFonts w:ascii="Times New Roman" w:hAnsi="Times New Roman" w:cs="Times New Roman"/>
-          <w:sz w:val="24"/>
-          <w:szCs w:val="24"/>
-        </w:rPr>
-        <w:t xml:space="preserve">, with De Larosière </w:t>
+        <w:t xml:space="preserve"> and Director of the Treasury </w:t>
       </w:r>
       <w:r>
         <w:rPr>
@@ -1695,7 +1938,33 @@
           <w:szCs w:val="24"/>
         </w:rPr>
         <w:lastRenderedPageBreak/>
-        <w:t>serving as Undersecretary for Monetary Affairs between 1974 and 1978.</w:t>
+        <w:t>before Giscard d’Estaing was elected President of France in May 1974</w:t>
+      </w:r>
+      <w:r>
+        <w:rPr>
+          <w:rFonts w:ascii="Times New Roman" w:hAnsi="Times New Roman" w:cs="Times New Roman"/>
+          <w:sz w:val="24"/>
+          <w:szCs w:val="24"/>
+        </w:rPr>
+        <w:t xml:space="preserve">, with De </w:t>
+      </w:r>
+      <w:proofErr w:type="spellStart"/>
+      <w:r>
+        <w:rPr>
+          <w:rFonts w:ascii="Times New Roman" w:hAnsi="Times New Roman" w:cs="Times New Roman"/>
+          <w:sz w:val="24"/>
+          <w:szCs w:val="24"/>
+        </w:rPr>
+        <w:t>Larosière</w:t>
+      </w:r>
+      <w:proofErr w:type="spellEnd"/>
+      <w:r>
+        <w:rPr>
+          <w:rFonts w:ascii="Times New Roman" w:hAnsi="Times New Roman" w:cs="Times New Roman"/>
+          <w:sz w:val="24"/>
+          <w:szCs w:val="24"/>
+        </w:rPr>
+        <w:t xml:space="preserve"> serving as Undersecretary for Monetary Affairs between 1974 and 1978.</w:t>
       </w:r>
       <w:r>
         <w:rPr>
@@ -1823,7 +2092,25 @@
           <w:sz w:val="24"/>
           <w:szCs w:val="24"/>
         </w:rPr>
-        <w:t>he Marjolin Report</w:t>
+        <w:t xml:space="preserve">he </w:t>
+      </w:r>
+      <w:proofErr w:type="spellStart"/>
+      <w:r>
+        <w:rPr>
+          <w:rFonts w:ascii="Times New Roman" w:hAnsi="Times New Roman" w:cs="Times New Roman"/>
+          <w:sz w:val="24"/>
+          <w:szCs w:val="24"/>
+        </w:rPr>
+        <w:t>Marjolin</w:t>
+      </w:r>
+      <w:proofErr w:type="spellEnd"/>
+      <w:r>
+        <w:rPr>
+          <w:rFonts w:ascii="Times New Roman" w:hAnsi="Times New Roman" w:cs="Times New Roman"/>
+          <w:sz w:val="24"/>
+          <w:szCs w:val="24"/>
+        </w:rPr>
+        <w:t xml:space="preserve"> Report</w:t>
       </w:r>
       <w:r>
         <w:rPr>
@@ -1927,8 +2214,18 @@
           <w:sz w:val="24"/>
           <w:szCs w:val="24"/>
         </w:rPr>
-        <w:t>De Larosière</w:t>
-      </w:r>
+        <w:t xml:space="preserve">De </w:t>
+      </w:r>
+      <w:proofErr w:type="spellStart"/>
+      <w:r>
+        <w:rPr>
+          <w:rFonts w:ascii="Times New Roman" w:hAnsi="Times New Roman" w:cs="Times New Roman"/>
+          <w:sz w:val="24"/>
+          <w:szCs w:val="24"/>
+        </w:rPr>
+        <w:t>Larosière</w:t>
+      </w:r>
+      <w:proofErr w:type="spellEnd"/>
       <w:r>
         <w:rPr>
           <w:rFonts w:ascii="Times New Roman" w:hAnsi="Times New Roman" w:cs="Times New Roman"/>
@@ -1959,7 +2256,25 @@
           <w:sz w:val="24"/>
           <w:szCs w:val="24"/>
         </w:rPr>
-        <w:t xml:space="preserve">. At the initiative of Giscard d’Estaing </w:t>
+        <w:t xml:space="preserve">. At the initiative of </w:t>
+      </w:r>
+      <w:proofErr w:type="gramStart"/>
+      <w:r>
+        <w:rPr>
+          <w:rFonts w:ascii="Times New Roman" w:hAnsi="Times New Roman" w:cs="Times New Roman"/>
+          <w:sz w:val="24"/>
+          <w:szCs w:val="24"/>
+        </w:rPr>
+        <w:t>Giscard d’Estaing</w:t>
+      </w:r>
+      <w:proofErr w:type="gramEnd"/>
+      <w:r>
+        <w:rPr>
+          <w:rFonts w:ascii="Times New Roman" w:hAnsi="Times New Roman" w:cs="Times New Roman"/>
+          <w:sz w:val="24"/>
+          <w:szCs w:val="24"/>
+        </w:rPr>
+        <w:t xml:space="preserve"> </w:t>
       </w:r>
       <w:r>
         <w:rPr>
@@ -2171,7 +2486,25 @@
           <w:sz w:val="24"/>
           <w:szCs w:val="24"/>
         </w:rPr>
-        <w:t xml:space="preserve"> Witteveen’s term came to a close in 1978, </w:t>
+        <w:t xml:space="preserve"> Witteveen’s term </w:t>
+      </w:r>
+      <w:proofErr w:type="gramStart"/>
+      <w:r>
+        <w:rPr>
+          <w:rFonts w:ascii="Times New Roman" w:hAnsi="Times New Roman" w:cs="Times New Roman"/>
+          <w:sz w:val="24"/>
+          <w:szCs w:val="24"/>
+        </w:rPr>
+        <w:t>came to a close</w:t>
+      </w:r>
+      <w:proofErr w:type="gramEnd"/>
+      <w:r>
+        <w:rPr>
+          <w:rFonts w:ascii="Times New Roman" w:hAnsi="Times New Roman" w:cs="Times New Roman"/>
+          <w:sz w:val="24"/>
+          <w:szCs w:val="24"/>
+        </w:rPr>
+        <w:t xml:space="preserve"> in 1978, </w:t>
       </w:r>
       <w:r>
         <w:rPr>
@@ -2187,7 +2520,25 @@
           <w:sz w:val="24"/>
           <w:szCs w:val="24"/>
         </w:rPr>
-        <w:t xml:space="preserve">e Larosière’s name forward and </w:t>
+        <w:t xml:space="preserve">e </w:t>
+      </w:r>
+      <w:proofErr w:type="spellStart"/>
+      <w:r>
+        <w:rPr>
+          <w:rFonts w:ascii="Times New Roman" w:hAnsi="Times New Roman" w:cs="Times New Roman"/>
+          <w:sz w:val="24"/>
+          <w:szCs w:val="24"/>
+        </w:rPr>
+        <w:t>Larosière’s</w:t>
+      </w:r>
+      <w:proofErr w:type="spellEnd"/>
+      <w:r>
+        <w:rPr>
+          <w:rFonts w:ascii="Times New Roman" w:hAnsi="Times New Roman" w:cs="Times New Roman"/>
+          <w:sz w:val="24"/>
+          <w:szCs w:val="24"/>
+        </w:rPr>
+        <w:t xml:space="preserve"> name forward and </w:t>
       </w:r>
       <w:r>
         <w:rPr>
@@ -2259,7 +2610,25 @@
           <w:sz w:val="24"/>
           <w:szCs w:val="24"/>
         </w:rPr>
-        <w:t xml:space="preserve">De Larosière began his </w:t>
+        <w:t xml:space="preserve">De </w:t>
+      </w:r>
+      <w:proofErr w:type="spellStart"/>
+      <w:r>
+        <w:rPr>
+          <w:rFonts w:ascii="Times New Roman" w:hAnsi="Times New Roman" w:cs="Times New Roman"/>
+          <w:sz w:val="24"/>
+          <w:szCs w:val="24"/>
+        </w:rPr>
+        <w:t>Larosière</w:t>
+      </w:r>
+      <w:proofErr w:type="spellEnd"/>
+      <w:r>
+        <w:rPr>
+          <w:rFonts w:ascii="Times New Roman" w:hAnsi="Times New Roman" w:cs="Times New Roman"/>
+          <w:sz w:val="24"/>
+          <w:szCs w:val="24"/>
+        </w:rPr>
+        <w:t xml:space="preserve"> began his </w:t>
       </w:r>
       <w:r>
         <w:rPr>
@@ -2363,7 +2732,25 @@
           <w:sz w:val="24"/>
           <w:szCs w:val="24"/>
         </w:rPr>
-        <w:t>. Upon assuming his new post h</w:t>
+        <w:t xml:space="preserve">. Upon assuming his new </w:t>
+      </w:r>
+      <w:proofErr w:type="gramStart"/>
+      <w:r>
+        <w:rPr>
+          <w:rFonts w:ascii="Times New Roman" w:hAnsi="Times New Roman" w:cs="Times New Roman"/>
+          <w:sz w:val="24"/>
+          <w:szCs w:val="24"/>
+        </w:rPr>
+        <w:t>post</w:t>
+      </w:r>
+      <w:proofErr w:type="gramEnd"/>
+      <w:r>
+        <w:rPr>
+          <w:rFonts w:ascii="Times New Roman" w:hAnsi="Times New Roman" w:cs="Times New Roman"/>
+          <w:sz w:val="24"/>
+          <w:szCs w:val="24"/>
+        </w:rPr>
+        <w:t xml:space="preserve"> h</w:t>
       </w:r>
       <w:r>
         <w:rPr>
@@ -2451,7 +2838,25 @@
           <w:sz w:val="24"/>
           <w:szCs w:val="24"/>
         </w:rPr>
-        <w:t xml:space="preserve">De Larosière </w:t>
+        <w:t xml:space="preserve">De </w:t>
+      </w:r>
+      <w:proofErr w:type="spellStart"/>
+      <w:r>
+        <w:rPr>
+          <w:rFonts w:ascii="Times New Roman" w:hAnsi="Times New Roman" w:cs="Times New Roman"/>
+          <w:sz w:val="24"/>
+          <w:szCs w:val="24"/>
+        </w:rPr>
+        <w:t>Larosière</w:t>
+      </w:r>
+      <w:proofErr w:type="spellEnd"/>
+      <w:r>
+        <w:rPr>
+          <w:rFonts w:ascii="Times New Roman" w:hAnsi="Times New Roman" w:cs="Times New Roman"/>
+          <w:sz w:val="24"/>
+          <w:szCs w:val="24"/>
+        </w:rPr>
+        <w:t xml:space="preserve"> </w:t>
       </w:r>
       <w:r>
         <w:rPr>
@@ -2643,7 +3048,25 @@
           <w:sz w:val="24"/>
           <w:szCs w:val="24"/>
         </w:rPr>
-        <w:t xml:space="preserve">De Larosière </w:t>
+        <w:t xml:space="preserve">De </w:t>
+      </w:r>
+      <w:proofErr w:type="spellStart"/>
+      <w:r>
+        <w:rPr>
+          <w:rFonts w:ascii="Times New Roman" w:hAnsi="Times New Roman" w:cs="Times New Roman"/>
+          <w:sz w:val="24"/>
+          <w:szCs w:val="24"/>
+        </w:rPr>
+        <w:t>Larosière</w:t>
+      </w:r>
+      <w:proofErr w:type="spellEnd"/>
+      <w:r>
+        <w:rPr>
+          <w:rFonts w:ascii="Times New Roman" w:hAnsi="Times New Roman" w:cs="Times New Roman"/>
+          <w:sz w:val="24"/>
+          <w:szCs w:val="24"/>
+        </w:rPr>
+        <w:t xml:space="preserve"> </w:t>
       </w:r>
       <w:r>
         <w:rPr>
@@ -2675,15 +3098,33 @@
           <w:sz w:val="24"/>
           <w:szCs w:val="24"/>
         </w:rPr>
-        <w:t xml:space="preserve"> intervened with a few large private banks, assuring them that a bailout program was being negotiated. US Federal Reserve Chairman Paul Volcker was eager to h</w:t>
-      </w:r>
-      <w:r>
-        <w:rPr>
-          <w:rFonts w:ascii="Times New Roman" w:hAnsi="Times New Roman" w:cs="Times New Roman"/>
-          <w:sz w:val="24"/>
-          <w:szCs w:val="24"/>
-        </w:rPr>
-        <w:t>elp and the result was a ‘coordinated debt strategy’</w:t>
+        <w:t xml:space="preserve"> intervened with a few large private banks, assuring them that a bailout program was being negotiated. US Federal Reserve Chairman Paul Volcker was eager to </w:t>
+      </w:r>
+      <w:proofErr w:type="gramStart"/>
+      <w:r>
+        <w:rPr>
+          <w:rFonts w:ascii="Times New Roman" w:hAnsi="Times New Roman" w:cs="Times New Roman"/>
+          <w:sz w:val="24"/>
+          <w:szCs w:val="24"/>
+        </w:rPr>
+        <w:t>h</w:t>
+      </w:r>
+      <w:r>
+        <w:rPr>
+          <w:rFonts w:ascii="Times New Roman" w:hAnsi="Times New Roman" w:cs="Times New Roman"/>
+          <w:sz w:val="24"/>
+          <w:szCs w:val="24"/>
+        </w:rPr>
+        <w:t>elp</w:t>
+      </w:r>
+      <w:proofErr w:type="gramEnd"/>
+      <w:r>
+        <w:rPr>
+          <w:rFonts w:ascii="Times New Roman" w:hAnsi="Times New Roman" w:cs="Times New Roman"/>
+          <w:sz w:val="24"/>
+          <w:szCs w:val="24"/>
+        </w:rPr>
+        <w:t xml:space="preserve"> and the result was a ‘coordinated debt strategy’</w:t>
       </w:r>
       <w:r>
         <w:rPr>
@@ -2715,7 +3156,25 @@
           <w:sz w:val="24"/>
           <w:szCs w:val="24"/>
         </w:rPr>
-        <w:t xml:space="preserve">De Larosière </w:t>
+        <w:t xml:space="preserve">De </w:t>
+      </w:r>
+      <w:proofErr w:type="spellStart"/>
+      <w:r>
+        <w:rPr>
+          <w:rFonts w:ascii="Times New Roman" w:hAnsi="Times New Roman" w:cs="Times New Roman"/>
+          <w:sz w:val="24"/>
+          <w:szCs w:val="24"/>
+        </w:rPr>
+        <w:t>Larosière</w:t>
+      </w:r>
+      <w:proofErr w:type="spellEnd"/>
+      <w:r>
+        <w:rPr>
+          <w:rFonts w:ascii="Times New Roman" w:hAnsi="Times New Roman" w:cs="Times New Roman"/>
+          <w:sz w:val="24"/>
+          <w:szCs w:val="24"/>
+        </w:rPr>
+        <w:t xml:space="preserve"> </w:t>
       </w:r>
       <w:r>
         <w:rPr>
@@ -2739,7 +3198,25 @@
           <w:sz w:val="24"/>
           <w:szCs w:val="24"/>
         </w:rPr>
-        <w:t>and others, pressing them to adopt austerity measures despite the political risks while at the same time acknowledging the particular needs and circumstances of each country</w:t>
+        <w:t xml:space="preserve">and others, pressing them to adopt austerity measures despite the political risks while at the same time acknowledging the </w:t>
+      </w:r>
+      <w:proofErr w:type="gramStart"/>
+      <w:r>
+        <w:rPr>
+          <w:rFonts w:ascii="Times New Roman" w:hAnsi="Times New Roman" w:cs="Times New Roman"/>
+          <w:sz w:val="24"/>
+          <w:szCs w:val="24"/>
+        </w:rPr>
+        <w:t>particular needs</w:t>
+      </w:r>
+      <w:proofErr w:type="gramEnd"/>
+      <w:r>
+        <w:rPr>
+          <w:rFonts w:ascii="Times New Roman" w:hAnsi="Times New Roman" w:cs="Times New Roman"/>
+          <w:sz w:val="24"/>
+          <w:szCs w:val="24"/>
+        </w:rPr>
+        <w:t xml:space="preserve"> and circumstances of each country</w:t>
       </w:r>
       <w:r>
         <w:rPr>
@@ -2868,7 +3345,25 @@
           <w:sz w:val="24"/>
           <w:szCs w:val="24"/>
         </w:rPr>
-        <w:t xml:space="preserve">e Larosière met with a group of bankers to tell them </w:t>
+        <w:t xml:space="preserve">e </w:t>
+      </w:r>
+      <w:proofErr w:type="spellStart"/>
+      <w:r>
+        <w:rPr>
+          <w:rFonts w:ascii="Times New Roman" w:hAnsi="Times New Roman" w:cs="Times New Roman"/>
+          <w:sz w:val="24"/>
+          <w:szCs w:val="24"/>
+        </w:rPr>
+        <w:t>Larosière</w:t>
+      </w:r>
+      <w:proofErr w:type="spellEnd"/>
+      <w:r>
+        <w:rPr>
+          <w:rFonts w:ascii="Times New Roman" w:hAnsi="Times New Roman" w:cs="Times New Roman"/>
+          <w:sz w:val="24"/>
+          <w:szCs w:val="24"/>
+        </w:rPr>
+        <w:t xml:space="preserve"> met with a group of bankers to tell them </w:t>
       </w:r>
       <w:r>
         <w:rPr>
@@ -3076,6 +3571,7 @@
           <w:sz w:val="24"/>
           <w:szCs w:val="24"/>
         </w:rPr>
+        <w:lastRenderedPageBreak/>
         <w:t>in October 1985</w:t>
       </w:r>
       <w:r>
@@ -3092,16 +3588,7 @@
           <w:sz w:val="24"/>
           <w:szCs w:val="24"/>
         </w:rPr>
-        <w:t xml:space="preserve">to alleviate the debt of the world’s poorest through a series of new loans and </w:t>
-      </w:r>
-      <w:r>
-        <w:rPr>
-          <w:rFonts w:ascii="Times New Roman" w:hAnsi="Times New Roman" w:cs="Times New Roman"/>
-          <w:sz w:val="24"/>
-          <w:szCs w:val="24"/>
-        </w:rPr>
-        <w:lastRenderedPageBreak/>
-        <w:t>outright debt forgiveness and took immediate steps to incorporate the strategy into IMF official policy.</w:t>
+        <w:t>to alleviate the debt of the world’s poorest through a series of new loans and outright debt forgiveness and took immediate steps to incorporate the strategy into IMF official policy.</w:t>
       </w:r>
     </w:p>
     <w:p>
@@ -3121,7 +3608,25 @@
           <w:sz w:val="24"/>
           <w:szCs w:val="24"/>
         </w:rPr>
-        <w:t>De Larosière, whose command of the English language was better than that of some Anglophone diplomats, developed a reputation for precision and clarity at international monetary conferences. He came to be seen as a ‘technocrat’, perhaps unfairly, accordin</w:t>
+        <w:t xml:space="preserve">De </w:t>
+      </w:r>
+      <w:proofErr w:type="spellStart"/>
+      <w:r>
+        <w:rPr>
+          <w:rFonts w:ascii="Times New Roman" w:hAnsi="Times New Roman" w:cs="Times New Roman"/>
+          <w:sz w:val="24"/>
+          <w:szCs w:val="24"/>
+        </w:rPr>
+        <w:t>Larosière</w:t>
+      </w:r>
+      <w:proofErr w:type="spellEnd"/>
+      <w:r>
+        <w:rPr>
+          <w:rFonts w:ascii="Times New Roman" w:hAnsi="Times New Roman" w:cs="Times New Roman"/>
+          <w:sz w:val="24"/>
+          <w:szCs w:val="24"/>
+        </w:rPr>
+        <w:t>, whose command of the English language was better than that of some Anglophone diplomats, developed a reputation for precision and clarity at international monetary conferences. He came to be seen as a ‘technocrat’, perhaps unfairly, accordin</w:t>
       </w:r>
       <w:r>
         <w:rPr>
@@ -3225,15 +3730,51 @@
           <w:sz w:val="24"/>
           <w:szCs w:val="24"/>
         </w:rPr>
-        <w:t>De Larosiè</w:t>
-      </w:r>
-      <w:r>
-        <w:rPr>
-          <w:rFonts w:ascii="Times New Roman" w:hAnsi="Times New Roman" w:cs="Times New Roman"/>
-          <w:sz w:val="24"/>
-          <w:szCs w:val="24"/>
-        </w:rPr>
-        <w:t xml:space="preserve">re was the point man on IMF conditionality, a role that bolstered his reputation as a tough-minded monetarist over his tenure (he was reappointed for a second term without opposition in 1983). He was willing to accept a loss of popularity as long as this resulted in bolstering IMF policy. Because most creditors preferred to have the IMF be the bearer of bad news, they thus held him and his stance in high regard. </w:t>
+        <w:t xml:space="preserve">De </w:t>
+      </w:r>
+      <w:proofErr w:type="spellStart"/>
+      <w:r>
+        <w:rPr>
+          <w:rFonts w:ascii="Times New Roman" w:hAnsi="Times New Roman" w:cs="Times New Roman"/>
+          <w:sz w:val="24"/>
+          <w:szCs w:val="24"/>
+        </w:rPr>
+        <w:t>Larosiè</w:t>
+      </w:r>
+      <w:r>
+        <w:rPr>
+          <w:rFonts w:ascii="Times New Roman" w:hAnsi="Times New Roman" w:cs="Times New Roman"/>
+          <w:sz w:val="24"/>
+          <w:szCs w:val="24"/>
+        </w:rPr>
+        <w:t>re</w:t>
+      </w:r>
+      <w:proofErr w:type="spellEnd"/>
+      <w:r>
+        <w:rPr>
+          <w:rFonts w:ascii="Times New Roman" w:hAnsi="Times New Roman" w:cs="Times New Roman"/>
+          <w:sz w:val="24"/>
+          <w:szCs w:val="24"/>
+        </w:rPr>
+        <w:t xml:space="preserve"> was the point man on IMF conditionality, a role that bolstered his reputation as a tough-minded monetarist over his tenure (he was reappointed for a second term without opposition in 1983). He was willing to accept a loss of popularity </w:t>
+      </w:r>
+      <w:proofErr w:type="gramStart"/>
+      <w:r>
+        <w:rPr>
+          <w:rFonts w:ascii="Times New Roman" w:hAnsi="Times New Roman" w:cs="Times New Roman"/>
+          <w:sz w:val="24"/>
+          <w:szCs w:val="24"/>
+        </w:rPr>
+        <w:t>as long as</w:t>
+      </w:r>
+      <w:proofErr w:type="gramEnd"/>
+      <w:r>
+        <w:rPr>
+          <w:rFonts w:ascii="Times New Roman" w:hAnsi="Times New Roman" w:cs="Times New Roman"/>
+          <w:sz w:val="24"/>
+          <w:szCs w:val="24"/>
+        </w:rPr>
+        <w:t xml:space="preserve"> this resulted in bolstering IMF policy. Because most creditors preferred to have the IMF be the bearer of bad news, they thus held him and his stance in high regard. </w:t>
       </w:r>
       <w:r>
         <w:rPr>
@@ -3257,7 +3798,25 @@
           <w:sz w:val="24"/>
           <w:szCs w:val="24"/>
         </w:rPr>
-        <w:t xml:space="preserve"> valued as a master of information and argument, often entering discussions with foreign bank presidents and finance ministers better armed with facts and figures about their own country’s conditions. He was deeply concerned about questions of privacy and discretion and was therefore trusted by many debtor country officials.</w:t>
+        <w:t xml:space="preserve"> valued as a </w:t>
+      </w:r>
+      <w:proofErr w:type="gramStart"/>
+      <w:r>
+        <w:rPr>
+          <w:rFonts w:ascii="Times New Roman" w:hAnsi="Times New Roman" w:cs="Times New Roman"/>
+          <w:sz w:val="24"/>
+          <w:szCs w:val="24"/>
+        </w:rPr>
+        <w:t>master of information</w:t>
+      </w:r>
+      <w:proofErr w:type="gramEnd"/>
+      <w:r>
+        <w:rPr>
+          <w:rFonts w:ascii="Times New Roman" w:hAnsi="Times New Roman" w:cs="Times New Roman"/>
+          <w:sz w:val="24"/>
+          <w:szCs w:val="24"/>
+        </w:rPr>
+        <w:t xml:space="preserve"> and argument, often entering discussions with foreign bank presidents and finance ministers better armed with facts and figures about their own country’s conditions. He was deeply concerned about questions of privacy and discretion and was therefore trusted by many debtor country officials.</w:t>
       </w:r>
       <w:r>
         <w:rPr>
@@ -3331,6 +3890,7 @@
         </w:rPr>
         <w:t xml:space="preserve">generally </w:t>
       </w:r>
+      <w:proofErr w:type="gramStart"/>
       <w:r>
         <w:rPr>
           <w:rFonts w:ascii="Times New Roman" w:hAnsi="Times New Roman" w:cs="Times New Roman"/>
@@ -3339,6 +3899,7 @@
         </w:rPr>
         <w:t>deserved</w:t>
       </w:r>
+      <w:proofErr w:type="gramEnd"/>
       <w:r>
         <w:rPr>
           <w:rFonts w:ascii="Times New Roman" w:hAnsi="Times New Roman" w:cs="Times New Roman"/>
@@ -3419,6 +3980,7 @@
         </w:rPr>
         <w:t xml:space="preserve">quickly settle with </w:t>
       </w:r>
+      <w:proofErr w:type="gramStart"/>
       <w:r>
         <w:rPr>
           <w:rFonts w:ascii="Times New Roman" w:hAnsi="Times New Roman" w:cs="Times New Roman"/>
@@ -3433,7 +3995,16 @@
           <w:sz w:val="24"/>
           <w:szCs w:val="24"/>
         </w:rPr>
-        <w:t xml:space="preserve"> major debtor</w:t>
+        <w:t xml:space="preserve"> major</w:t>
+      </w:r>
+      <w:proofErr w:type="gramEnd"/>
+      <w:r>
+        <w:rPr>
+          <w:rFonts w:ascii="Times New Roman" w:hAnsi="Times New Roman" w:cs="Times New Roman"/>
+          <w:sz w:val="24"/>
+          <w:szCs w:val="24"/>
+        </w:rPr>
+        <w:t xml:space="preserve"> debtor</w:t>
       </w:r>
       <w:r>
         <w:rPr>
@@ -3533,8 +4104,18 @@
           <w:sz w:val="24"/>
           <w:szCs w:val="24"/>
         </w:rPr>
-        <w:t>De Larosière</w:t>
-      </w:r>
+        <w:t xml:space="preserve">De </w:t>
+      </w:r>
+      <w:proofErr w:type="spellStart"/>
+      <w:r>
+        <w:rPr>
+          <w:rFonts w:ascii="Times New Roman" w:hAnsi="Times New Roman" w:cs="Times New Roman"/>
+          <w:sz w:val="24"/>
+          <w:szCs w:val="24"/>
+        </w:rPr>
+        <w:t>Larosière</w:t>
+      </w:r>
+      <w:proofErr w:type="spellEnd"/>
       <w:r>
         <w:rPr>
           <w:rFonts w:ascii="Times New Roman" w:hAnsi="Times New Roman" w:cs="Times New Roman"/>
@@ -3861,8 +4442,18 @@
           <w:sz w:val="24"/>
           <w:szCs w:val="24"/>
         </w:rPr>
-        <w:t xml:space="preserve"> Committee</w:t>
-      </w:r>
+        <w:t xml:space="preserve"> </w:t>
+      </w:r>
+      <w:proofErr w:type="gramStart"/>
+      <w:r>
+        <w:rPr>
+          <w:rFonts w:ascii="Times New Roman" w:hAnsi="Times New Roman" w:cs="Times New Roman"/>
+          <w:sz w:val="24"/>
+          <w:szCs w:val="24"/>
+        </w:rPr>
+        <w:t>Committee</w:t>
+      </w:r>
+      <w:proofErr w:type="gramEnd"/>
       <w:r>
         <w:rPr>
           <w:rFonts w:ascii="Times New Roman" w:hAnsi="Times New Roman" w:cs="Times New Roman"/>
@@ -4109,7 +4700,16 @@
           <w:sz w:val="24"/>
           <w:szCs w:val="24"/>
         </w:rPr>
-        <w:t>De Laro</w:t>
+        <w:t xml:space="preserve">De </w:t>
+      </w:r>
+      <w:proofErr w:type="spellStart"/>
+      <w:r>
+        <w:rPr>
+          <w:rFonts w:ascii="Times New Roman" w:hAnsi="Times New Roman" w:cs="Times New Roman"/>
+          <w:sz w:val="24"/>
+          <w:szCs w:val="24"/>
+        </w:rPr>
+        <w:t>Laro</w:t>
       </w:r>
       <w:r>
         <w:rPr>
@@ -4119,6 +4719,7 @@
         </w:rPr>
         <w:t>sière</w:t>
       </w:r>
+      <w:proofErr w:type="spellEnd"/>
       <w:r>
         <w:rPr>
           <w:rFonts w:ascii="Times New Roman" w:hAnsi="Times New Roman" w:cs="Times New Roman"/>
@@ -4157,7 +4758,25 @@
           <w:sz w:val="24"/>
           <w:szCs w:val="24"/>
         </w:rPr>
-        <w:t xml:space="preserve"> and succeeded in concluding an agreement with Pöhl to</w:t>
+        <w:t xml:space="preserve"> and succeeded in concluding an agreement with </w:t>
+      </w:r>
+      <w:proofErr w:type="spellStart"/>
+      <w:r>
+        <w:rPr>
+          <w:rFonts w:ascii="Times New Roman" w:hAnsi="Times New Roman" w:cs="Times New Roman"/>
+          <w:sz w:val="24"/>
+          <w:szCs w:val="24"/>
+        </w:rPr>
+        <w:t>Pöhl</w:t>
+      </w:r>
+      <w:proofErr w:type="spellEnd"/>
+      <w:r>
+        <w:rPr>
+          <w:rFonts w:ascii="Times New Roman" w:hAnsi="Times New Roman" w:cs="Times New Roman"/>
+          <w:sz w:val="24"/>
+          <w:szCs w:val="24"/>
+        </w:rPr>
+        <w:t xml:space="preserve"> to</w:t>
       </w:r>
       <w:r>
         <w:rPr>
@@ -4269,7 +4888,25 @@
           <w:sz w:val="24"/>
           <w:szCs w:val="24"/>
         </w:rPr>
-        <w:t xml:space="preserve">De Larosière succeeded in </w:t>
+        <w:t xml:space="preserve">De </w:t>
+      </w:r>
+      <w:proofErr w:type="spellStart"/>
+      <w:r>
+        <w:rPr>
+          <w:rFonts w:ascii="Times New Roman" w:hAnsi="Times New Roman" w:cs="Times New Roman"/>
+          <w:sz w:val="24"/>
+          <w:szCs w:val="24"/>
+        </w:rPr>
+        <w:t>Larosière</w:t>
+      </w:r>
+      <w:proofErr w:type="spellEnd"/>
+      <w:r>
+        <w:rPr>
+          <w:rFonts w:ascii="Times New Roman" w:hAnsi="Times New Roman" w:cs="Times New Roman"/>
+          <w:sz w:val="24"/>
+          <w:szCs w:val="24"/>
+        </w:rPr>
+        <w:t xml:space="preserve"> succeeded in </w:t>
       </w:r>
       <w:r>
         <w:rPr>
@@ -4365,15 +5002,33 @@
           <w:sz w:val="24"/>
           <w:szCs w:val="24"/>
         </w:rPr>
-        <w:t>Between 1990 and 1993 De Larosiè</w:t>
-      </w:r>
-      <w:r>
-        <w:rPr>
-          <w:rFonts w:ascii="Times New Roman" w:hAnsi="Times New Roman" w:cs="Times New Roman"/>
-          <w:sz w:val="24"/>
-          <w:szCs w:val="24"/>
-        </w:rPr>
-        <w:t>re chaired the Group of 10</w:t>
+        <w:t xml:space="preserve">Between 1990 and 1993 De </w:t>
+      </w:r>
+      <w:proofErr w:type="spellStart"/>
+      <w:r>
+        <w:rPr>
+          <w:rFonts w:ascii="Times New Roman" w:hAnsi="Times New Roman" w:cs="Times New Roman"/>
+          <w:sz w:val="24"/>
+          <w:szCs w:val="24"/>
+        </w:rPr>
+        <w:t>Larosiè</w:t>
+      </w:r>
+      <w:r>
+        <w:rPr>
+          <w:rFonts w:ascii="Times New Roman" w:hAnsi="Times New Roman" w:cs="Times New Roman"/>
+          <w:sz w:val="24"/>
+          <w:szCs w:val="24"/>
+        </w:rPr>
+        <w:t>re</w:t>
+      </w:r>
+      <w:proofErr w:type="spellEnd"/>
+      <w:r>
+        <w:rPr>
+          <w:rFonts w:ascii="Times New Roman" w:hAnsi="Times New Roman" w:cs="Times New Roman"/>
+          <w:sz w:val="24"/>
+          <w:szCs w:val="24"/>
+        </w:rPr>
+        <w:t xml:space="preserve"> chaired the Group of 10</w:t>
       </w:r>
       <w:r>
         <w:rPr>
@@ -4589,7 +5244,16 @@
           <w:sz w:val="24"/>
           <w:szCs w:val="24"/>
         </w:rPr>
-        <w:t xml:space="preserve"> succeeded in attacking the British pound. In </w:t>
+        <w:t xml:space="preserve"> succeeded in </w:t>
+      </w:r>
+      <w:r>
+        <w:rPr>
+          <w:rFonts w:ascii="Times New Roman" w:hAnsi="Times New Roman" w:cs="Times New Roman"/>
+          <w:sz w:val="24"/>
+          <w:szCs w:val="24"/>
+        </w:rPr>
+        <w:lastRenderedPageBreak/>
+        <w:t xml:space="preserve">attacking the British pound. In </w:t>
       </w:r>
       <w:r>
         <w:rPr>
@@ -4615,14 +5279,23 @@
         </w:rPr>
         <w:t xml:space="preserve">ranc, however, De </w:t>
       </w:r>
-      <w:r>
-        <w:rPr>
-          <w:rFonts w:ascii="Times New Roman" w:hAnsi="Times New Roman" w:cs="Times New Roman"/>
-          <w:sz w:val="24"/>
-          <w:szCs w:val="24"/>
-        </w:rPr>
-        <w:lastRenderedPageBreak/>
-        <w:t>Larosière,</w:t>
+      <w:proofErr w:type="spellStart"/>
+      <w:r>
+        <w:rPr>
+          <w:rFonts w:ascii="Times New Roman" w:hAnsi="Times New Roman" w:cs="Times New Roman"/>
+          <w:sz w:val="24"/>
+          <w:szCs w:val="24"/>
+        </w:rPr>
+        <w:t>Larosière</w:t>
+      </w:r>
+      <w:proofErr w:type="spellEnd"/>
+      <w:r>
+        <w:rPr>
+          <w:rFonts w:ascii="Times New Roman" w:hAnsi="Times New Roman" w:cs="Times New Roman"/>
+          <w:sz w:val="24"/>
+          <w:szCs w:val="24"/>
+        </w:rPr>
+        <w:t>,</w:t>
       </w:r>
       <w:r>
         <w:rPr>
@@ -4666,7 +5339,43 @@
           <w:sz w:val="24"/>
           <w:szCs w:val="24"/>
         </w:rPr>
-        <w:t xml:space="preserve">In 1993 President Mitterand put forward De Larosière’s name </w:t>
+        <w:t xml:space="preserve">In 1993 President </w:t>
+      </w:r>
+      <w:proofErr w:type="spellStart"/>
+      <w:r>
+        <w:rPr>
+          <w:rFonts w:ascii="Times New Roman" w:hAnsi="Times New Roman" w:cs="Times New Roman"/>
+          <w:sz w:val="24"/>
+          <w:szCs w:val="24"/>
+        </w:rPr>
+        <w:t>Mitterand</w:t>
+      </w:r>
+      <w:proofErr w:type="spellEnd"/>
+      <w:r>
+        <w:rPr>
+          <w:rFonts w:ascii="Times New Roman" w:hAnsi="Times New Roman" w:cs="Times New Roman"/>
+          <w:sz w:val="24"/>
+          <w:szCs w:val="24"/>
+        </w:rPr>
+        <w:t xml:space="preserve"> put forward De </w:t>
+      </w:r>
+      <w:proofErr w:type="spellStart"/>
+      <w:r>
+        <w:rPr>
+          <w:rFonts w:ascii="Times New Roman" w:hAnsi="Times New Roman" w:cs="Times New Roman"/>
+          <w:sz w:val="24"/>
+          <w:szCs w:val="24"/>
+        </w:rPr>
+        <w:t>Larosière’s</w:t>
+      </w:r>
+      <w:proofErr w:type="spellEnd"/>
+      <w:r>
+        <w:rPr>
+          <w:rFonts w:ascii="Times New Roman" w:hAnsi="Times New Roman" w:cs="Times New Roman"/>
+          <w:sz w:val="24"/>
+          <w:szCs w:val="24"/>
+        </w:rPr>
+        <w:t xml:space="preserve"> name </w:t>
       </w:r>
       <w:r>
         <w:rPr>
@@ -4874,7 +5583,25 @@
           <w:sz w:val="24"/>
           <w:szCs w:val="24"/>
         </w:rPr>
-        <w:t>e Larosière had no apparent political affinities, making him more</w:t>
+        <w:t xml:space="preserve">e </w:t>
+      </w:r>
+      <w:proofErr w:type="spellStart"/>
+      <w:r>
+        <w:rPr>
+          <w:rFonts w:ascii="Times New Roman" w:hAnsi="Times New Roman" w:cs="Times New Roman"/>
+          <w:sz w:val="24"/>
+          <w:szCs w:val="24"/>
+        </w:rPr>
+        <w:t>Larosière</w:t>
+      </w:r>
+      <w:proofErr w:type="spellEnd"/>
+      <w:r>
+        <w:rPr>
+          <w:rFonts w:ascii="Times New Roman" w:hAnsi="Times New Roman" w:cs="Times New Roman"/>
+          <w:sz w:val="24"/>
+          <w:szCs w:val="24"/>
+        </w:rPr>
+        <w:t xml:space="preserve"> had no apparent political affinities, making him more</w:t>
       </w:r>
       <w:r>
         <w:rPr>
@@ -4930,7 +5657,25 @@
           <w:sz w:val="24"/>
           <w:szCs w:val="24"/>
         </w:rPr>
-        <w:t xml:space="preserve">e Larosière was elected unanimously. </w:t>
+        <w:t xml:space="preserve">e </w:t>
+      </w:r>
+      <w:proofErr w:type="spellStart"/>
+      <w:r>
+        <w:rPr>
+          <w:rFonts w:ascii="Times New Roman" w:hAnsi="Times New Roman" w:cs="Times New Roman"/>
+          <w:sz w:val="24"/>
+          <w:szCs w:val="24"/>
+        </w:rPr>
+        <w:t>Larosière</w:t>
+      </w:r>
+      <w:proofErr w:type="spellEnd"/>
+      <w:r>
+        <w:rPr>
+          <w:rFonts w:ascii="Times New Roman" w:hAnsi="Times New Roman" w:cs="Times New Roman"/>
+          <w:sz w:val="24"/>
+          <w:szCs w:val="24"/>
+        </w:rPr>
+        <w:t xml:space="preserve"> was elected unanimously. </w:t>
       </w:r>
       <w:r>
         <w:rPr>
@@ -4954,7 +5699,25 @@
           <w:sz w:val="24"/>
           <w:szCs w:val="24"/>
         </w:rPr>
-        <w:t>some very competent staff had been brought on board and it was poised for serious work</w:t>
+        <w:t xml:space="preserve">some very competent staff had been brought on </w:t>
+      </w:r>
+      <w:proofErr w:type="gramStart"/>
+      <w:r>
+        <w:rPr>
+          <w:rFonts w:ascii="Times New Roman" w:hAnsi="Times New Roman" w:cs="Times New Roman"/>
+          <w:sz w:val="24"/>
+          <w:szCs w:val="24"/>
+        </w:rPr>
+        <w:t>board</w:t>
+      </w:r>
+      <w:proofErr w:type="gramEnd"/>
+      <w:r>
+        <w:rPr>
+          <w:rFonts w:ascii="Times New Roman" w:hAnsi="Times New Roman" w:cs="Times New Roman"/>
+          <w:sz w:val="24"/>
+          <w:szCs w:val="24"/>
+        </w:rPr>
+        <w:t xml:space="preserve"> and it was poised for serious work</w:t>
       </w:r>
       <w:r>
         <w:rPr>
@@ -4978,8 +5741,27 @@
           <w:sz w:val="24"/>
           <w:szCs w:val="24"/>
         </w:rPr>
-        <w:t xml:space="preserve">e Larosière was personally offended by what he </w:t>
-      </w:r>
+        <w:t xml:space="preserve">e </w:t>
+      </w:r>
+      <w:proofErr w:type="spellStart"/>
+      <w:r>
+        <w:rPr>
+          <w:rFonts w:ascii="Times New Roman" w:hAnsi="Times New Roman" w:cs="Times New Roman"/>
+          <w:sz w:val="24"/>
+          <w:szCs w:val="24"/>
+        </w:rPr>
+        <w:t>Larosière</w:t>
+      </w:r>
+      <w:proofErr w:type="spellEnd"/>
+      <w:r>
+        <w:rPr>
+          <w:rFonts w:ascii="Times New Roman" w:hAnsi="Times New Roman" w:cs="Times New Roman"/>
+          <w:sz w:val="24"/>
+          <w:szCs w:val="24"/>
+        </w:rPr>
+        <w:t xml:space="preserve"> was personally offended by what he </w:t>
+      </w:r>
+      <w:proofErr w:type="gramStart"/>
       <w:r>
         <w:rPr>
           <w:rFonts w:ascii="Times New Roman" w:hAnsi="Times New Roman" w:cs="Times New Roman"/>
@@ -4988,6 +5770,7 @@
         </w:rPr>
         <w:t>found</w:t>
       </w:r>
+      <w:proofErr w:type="gramEnd"/>
       <w:r>
         <w:rPr>
           <w:rFonts w:ascii="Times New Roman" w:hAnsi="Times New Roman" w:cs="Times New Roman"/>
@@ -5090,7 +5873,25 @@
           <w:sz w:val="24"/>
           <w:szCs w:val="24"/>
         </w:rPr>
-        <w:t>he loan portfolio quadrupled and he spearheaded efforts to bring the loan recipients into conformity wit</w:t>
+        <w:t xml:space="preserve">he loan portfolio </w:t>
+      </w:r>
+      <w:proofErr w:type="gramStart"/>
+      <w:r>
+        <w:rPr>
+          <w:rFonts w:ascii="Times New Roman" w:hAnsi="Times New Roman" w:cs="Times New Roman"/>
+          <w:sz w:val="24"/>
+          <w:szCs w:val="24"/>
+        </w:rPr>
+        <w:t>quadrupled</w:t>
+      </w:r>
+      <w:proofErr w:type="gramEnd"/>
+      <w:r>
+        <w:rPr>
+          <w:rFonts w:ascii="Times New Roman" w:hAnsi="Times New Roman" w:cs="Times New Roman"/>
+          <w:sz w:val="24"/>
+          <w:szCs w:val="24"/>
+        </w:rPr>
+        <w:t xml:space="preserve"> and he spearheaded efforts to bring the loan recipients into conformity wit</w:t>
       </w:r>
       <w:r>
         <w:rPr>
@@ -5178,7 +5979,16 @@
           <w:sz w:val="24"/>
           <w:szCs w:val="24"/>
         </w:rPr>
-        <w:t xml:space="preserve"> formally ente</w:t>
+        <w:t xml:space="preserve"> formally </w:t>
+      </w:r>
+      <w:proofErr w:type="gramStart"/>
+      <w:r>
+        <w:rPr>
+          <w:rFonts w:ascii="Times New Roman" w:hAnsi="Times New Roman" w:cs="Times New Roman"/>
+          <w:sz w:val="24"/>
+          <w:szCs w:val="24"/>
+        </w:rPr>
+        <w:t>ente</w:t>
       </w:r>
       <w:r>
         <w:rPr>
@@ -5194,7 +6004,16 @@
           <w:sz w:val="24"/>
           <w:szCs w:val="24"/>
         </w:rPr>
-        <w:t xml:space="preserve"> into retirement. </w:t>
+        <w:t xml:space="preserve"> into</w:t>
+      </w:r>
+      <w:proofErr w:type="gramEnd"/>
+      <w:r>
+        <w:rPr>
+          <w:rFonts w:ascii="Times New Roman" w:hAnsi="Times New Roman" w:cs="Times New Roman"/>
+          <w:sz w:val="24"/>
+          <w:szCs w:val="24"/>
+        </w:rPr>
+        <w:t xml:space="preserve"> retirement. </w:t>
       </w:r>
     </w:p>
     <w:p>
@@ -5222,8 +6041,18 @@
           <w:sz w:val="24"/>
           <w:szCs w:val="24"/>
         </w:rPr>
-        <w:t>De Larosière</w:t>
-      </w:r>
+        <w:t xml:space="preserve">De </w:t>
+      </w:r>
+      <w:proofErr w:type="spellStart"/>
+      <w:r>
+        <w:rPr>
+          <w:rFonts w:ascii="Times New Roman" w:hAnsi="Times New Roman" w:cs="Times New Roman"/>
+          <w:sz w:val="24"/>
+          <w:szCs w:val="24"/>
+        </w:rPr>
+        <w:t>Larosière</w:t>
+      </w:r>
+      <w:proofErr w:type="spellEnd"/>
       <w:r>
         <w:rPr>
           <w:rFonts w:ascii="Times New Roman" w:hAnsi="Times New Roman" w:cs="Times New Roman"/>
@@ -5278,7 +6107,34 @@
           <w:sz w:val="24"/>
           <w:szCs w:val="24"/>
         </w:rPr>
-        <w:t xml:space="preserve"> Observatoire de l’Epargne Europ</w:t>
+        <w:t xml:space="preserve"> Observatoire de </w:t>
+      </w:r>
+      <w:proofErr w:type="spellStart"/>
+      <w:r>
+        <w:rPr>
+          <w:rFonts w:ascii="Times New Roman" w:hAnsi="Times New Roman" w:cs="Times New Roman"/>
+          <w:sz w:val="24"/>
+          <w:szCs w:val="24"/>
+        </w:rPr>
+        <w:t>l’Epargne</w:t>
+      </w:r>
+      <w:proofErr w:type="spellEnd"/>
+      <w:r>
+        <w:rPr>
+          <w:rFonts w:ascii="Times New Roman" w:hAnsi="Times New Roman" w:cs="Times New Roman"/>
+          <w:sz w:val="24"/>
+          <w:szCs w:val="24"/>
+        </w:rPr>
+        <w:t xml:space="preserve"> </w:t>
+      </w:r>
+      <w:proofErr w:type="spellStart"/>
+      <w:r>
+        <w:rPr>
+          <w:rFonts w:ascii="Times New Roman" w:hAnsi="Times New Roman" w:cs="Times New Roman"/>
+          <w:sz w:val="24"/>
+          <w:szCs w:val="24"/>
+        </w:rPr>
+        <w:t>Europ</w:t>
       </w:r>
       <w:r>
         <w:rPr>
@@ -5296,6 +6152,7 @@
         </w:rPr>
         <w:t>enne</w:t>
       </w:r>
+      <w:proofErr w:type="spellEnd"/>
       <w:r>
         <w:rPr>
           <w:rFonts w:ascii="Times New Roman" w:hAnsi="Times New Roman" w:cs="Times New Roman"/>
@@ -5318,7 +6175,25 @@
           <w:sz w:val="24"/>
           <w:szCs w:val="24"/>
         </w:rPr>
-        <w:t>), in order to share information and analysis about savings and loan activities across Europe.</w:t>
+        <w:t xml:space="preserve">), </w:t>
+      </w:r>
+      <w:proofErr w:type="gramStart"/>
+      <w:r>
+        <w:rPr>
+          <w:rFonts w:ascii="Times New Roman" w:hAnsi="Times New Roman" w:cs="Times New Roman"/>
+          <w:sz w:val="24"/>
+          <w:szCs w:val="24"/>
+        </w:rPr>
+        <w:t>in order to</w:t>
+      </w:r>
+      <w:proofErr w:type="gramEnd"/>
+      <w:r>
+        <w:rPr>
+          <w:rFonts w:ascii="Times New Roman" w:hAnsi="Times New Roman" w:cs="Times New Roman"/>
+          <w:sz w:val="24"/>
+          <w:szCs w:val="24"/>
+        </w:rPr>
+        <w:t xml:space="preserve"> share information and analysis about savings and loan activities across Europe.</w:t>
       </w:r>
       <w:r>
         <w:rPr>
@@ -5558,15 +6433,51 @@
           <w:sz w:val="24"/>
           <w:szCs w:val="24"/>
         </w:rPr>
-        <w:t xml:space="preserve"> policies, the looseness of which he blames for the 2008 financial crisis (De Larosière 2010).</w:t>
-      </w:r>
-      <w:r>
-        <w:rPr>
-          <w:rFonts w:ascii="Times New Roman" w:hAnsi="Times New Roman" w:cs="Times New Roman"/>
-          <w:sz w:val="24"/>
-          <w:szCs w:val="24"/>
-        </w:rPr>
-        <w:t xml:space="preserve"> In 2009, shortly after the global financial crisis, the EU asked De Larosière to chair a high-level panel on the reform of the European financial supervisory architecture, the result of which was a detailed report with recommendations on how such a crisis could be averted in the future. In particular, the report called for the creation of new EU coordinating bodies to monitor systemic risk and coordinate regional responses. </w:t>
+        <w:t xml:space="preserve"> policies, the looseness of which he blames for the 2008 financial crisis (De </w:t>
+      </w:r>
+      <w:proofErr w:type="spellStart"/>
+      <w:r>
+        <w:rPr>
+          <w:rFonts w:ascii="Times New Roman" w:hAnsi="Times New Roman" w:cs="Times New Roman"/>
+          <w:sz w:val="24"/>
+          <w:szCs w:val="24"/>
+        </w:rPr>
+        <w:t>Larosière</w:t>
+      </w:r>
+      <w:proofErr w:type="spellEnd"/>
+      <w:r>
+        <w:rPr>
+          <w:rFonts w:ascii="Times New Roman" w:hAnsi="Times New Roman" w:cs="Times New Roman"/>
+          <w:sz w:val="24"/>
+          <w:szCs w:val="24"/>
+        </w:rPr>
+        <w:t xml:space="preserve"> 2010).</w:t>
+      </w:r>
+      <w:r>
+        <w:rPr>
+          <w:rFonts w:ascii="Times New Roman" w:hAnsi="Times New Roman" w:cs="Times New Roman"/>
+          <w:sz w:val="24"/>
+          <w:szCs w:val="24"/>
+        </w:rPr>
+        <w:t xml:space="preserve"> In 2009, shortly after the global financial crisis, the EU asked De </w:t>
+      </w:r>
+      <w:proofErr w:type="spellStart"/>
+      <w:r>
+        <w:rPr>
+          <w:rFonts w:ascii="Times New Roman" w:hAnsi="Times New Roman" w:cs="Times New Roman"/>
+          <w:sz w:val="24"/>
+          <w:szCs w:val="24"/>
+        </w:rPr>
+        <w:t>Larosière</w:t>
+      </w:r>
+      <w:proofErr w:type="spellEnd"/>
+      <w:r>
+        <w:rPr>
+          <w:rFonts w:ascii="Times New Roman" w:hAnsi="Times New Roman" w:cs="Times New Roman"/>
+          <w:sz w:val="24"/>
+          <w:szCs w:val="24"/>
+        </w:rPr>
+        <w:t xml:space="preserve"> to chair a high-level panel on the reform of the European financial supervisory architecture, the result of which was a detailed report with recommendations on how such a crisis could be averted in the future. In particular, the report called for the creation of new EU coordinating bodies to monitor systemic risk and coordinate regional responses. </w:t>
       </w:r>
       <w:r>
         <w:rPr>
@@ -5630,7 +6541,25 @@
           <w:sz w:val="24"/>
           <w:szCs w:val="24"/>
         </w:rPr>
-        <w:t xml:space="preserve">In 2011 De Larosière co-authored the </w:t>
+        <w:t xml:space="preserve">In 2011 De </w:t>
+      </w:r>
+      <w:proofErr w:type="spellStart"/>
+      <w:r>
+        <w:rPr>
+          <w:rFonts w:ascii="Times New Roman" w:hAnsi="Times New Roman" w:cs="Times New Roman"/>
+          <w:sz w:val="24"/>
+          <w:szCs w:val="24"/>
+        </w:rPr>
+        <w:t>Larosière</w:t>
+      </w:r>
+      <w:proofErr w:type="spellEnd"/>
+      <w:r>
+        <w:rPr>
+          <w:rFonts w:ascii="Times New Roman" w:hAnsi="Times New Roman" w:cs="Times New Roman"/>
+          <w:sz w:val="24"/>
+          <w:szCs w:val="24"/>
+        </w:rPr>
+        <w:t xml:space="preserve"> co-authored the </w:t>
       </w:r>
       <w:r>
         <w:rPr>
@@ -5688,7 +6617,25 @@
           <w:sz w:val="24"/>
           <w:szCs w:val="24"/>
         </w:rPr>
-        <w:t>De Larosière has received numerous commendations and awards, includ</w:t>
+        <w:t xml:space="preserve">De </w:t>
+      </w:r>
+      <w:proofErr w:type="spellStart"/>
+      <w:r>
+        <w:rPr>
+          <w:rFonts w:ascii="Times New Roman" w:hAnsi="Times New Roman" w:cs="Times New Roman"/>
+          <w:sz w:val="24"/>
+          <w:szCs w:val="24"/>
+        </w:rPr>
+        <w:t>Larosière</w:t>
+      </w:r>
+      <w:proofErr w:type="spellEnd"/>
+      <w:r>
+        <w:rPr>
+          <w:rFonts w:ascii="Times New Roman" w:hAnsi="Times New Roman" w:cs="Times New Roman"/>
+          <w:sz w:val="24"/>
+          <w:szCs w:val="24"/>
+        </w:rPr>
+        <w:t xml:space="preserve"> has received numerous commendations and awards, includ</w:t>
       </w:r>
       <w:r>
         <w:rPr>
@@ -5704,7 +6651,25 @@
           <w:sz w:val="24"/>
           <w:szCs w:val="24"/>
         </w:rPr>
-        <w:t>gion d’Honneur.</w:t>
+        <w:t xml:space="preserve">gion </w:t>
+      </w:r>
+      <w:proofErr w:type="spellStart"/>
+      <w:r>
+        <w:rPr>
+          <w:rFonts w:ascii="Times New Roman" w:hAnsi="Times New Roman" w:cs="Times New Roman"/>
+          <w:sz w:val="24"/>
+          <w:szCs w:val="24"/>
+        </w:rPr>
+        <w:t>d’Honneur</w:t>
+      </w:r>
+      <w:proofErr w:type="spellEnd"/>
+      <w:r>
+        <w:rPr>
+          <w:rFonts w:ascii="Times New Roman" w:hAnsi="Times New Roman" w:cs="Times New Roman"/>
+          <w:sz w:val="24"/>
+          <w:szCs w:val="24"/>
+        </w:rPr>
+        <w:t>.</w:t>
       </w:r>
       <w:r>
         <w:rPr>
@@ -5752,7 +6717,25 @@
           <w:sz w:val="24"/>
           <w:szCs w:val="24"/>
         </w:rPr>
-        <w:t>of the Institut de France</w:t>
+        <w:t xml:space="preserve">of the </w:t>
+      </w:r>
+      <w:proofErr w:type="spellStart"/>
+      <w:r>
+        <w:rPr>
+          <w:rFonts w:ascii="Times New Roman" w:hAnsi="Times New Roman" w:cs="Times New Roman"/>
+          <w:sz w:val="24"/>
+          <w:szCs w:val="24"/>
+        </w:rPr>
+        <w:t>Institut</w:t>
+      </w:r>
+      <w:proofErr w:type="spellEnd"/>
+      <w:r>
+        <w:rPr>
+          <w:rFonts w:ascii="Times New Roman" w:hAnsi="Times New Roman" w:cs="Times New Roman"/>
+          <w:sz w:val="24"/>
+          <w:szCs w:val="24"/>
+        </w:rPr>
+        <w:t xml:space="preserve"> de France</w:t>
       </w:r>
       <w:r>
         <w:rPr>
@@ -5794,6 +6777,7 @@
           <w:lang w:val="fr-FR"/>
         </w:rPr>
       </w:pPr>
+      <w:proofErr w:type="gramStart"/>
       <w:r>
         <w:rPr>
           <w:rFonts w:ascii="Times New Roman" w:hAnsi="Times New Roman" w:cs="Times New Roman"/>
@@ -5802,6 +6786,7 @@
           <w:szCs w:val="24"/>
           <w:lang w:val="fr-FR"/>
         </w:rPr>
+        <w:lastRenderedPageBreak/>
         <w:t>PUBLICATIONS</w:t>
       </w:r>
       <w:r>
@@ -5813,6 +6798,7 @@
         </w:rPr>
         <w:t>:</w:t>
       </w:r>
+      <w:proofErr w:type="gramEnd"/>
       <w:r>
         <w:rPr>
           <w:rFonts w:ascii="Times New Roman" w:hAnsi="Times New Roman" w:cs="Times New Roman"/>
@@ -5879,8 +6865,19 @@
           <w:szCs w:val="24"/>
           <w:lang w:val="fr-FR"/>
         </w:rPr>
-        <w:t>, London 1962;</w:t>
-      </w:r>
+        <w:t xml:space="preserve">, London </w:t>
+      </w:r>
+      <w:proofErr w:type="gramStart"/>
+      <w:r>
+        <w:rPr>
+          <w:rFonts w:ascii="Times New Roman" w:hAnsi="Times New Roman" w:cs="Times New Roman"/>
+          <w:sz w:val="24"/>
+          <w:szCs w:val="24"/>
+          <w:lang w:val="fr-FR"/>
+        </w:rPr>
+        <w:t>1962;</w:t>
+      </w:r>
+      <w:proofErr w:type="gramEnd"/>
       <w:r>
         <w:rPr>
           <w:rFonts w:ascii="Times New Roman" w:hAnsi="Times New Roman" w:cs="Times New Roman"/>
@@ -5908,8 +6905,9 @@
           <w:szCs w:val="24"/>
           <w:lang w:val="fr-FR"/>
         </w:rPr>
-        <w:t xml:space="preserve">, Grenoble 1985 (with R. Salomon </w:t>
-      </w:r>
+        <w:t>, Grenoble 1985 (</w:t>
+      </w:r>
+      <w:proofErr w:type="spellStart"/>
       <w:r>
         <w:rPr>
           <w:rFonts w:ascii="Times New Roman" w:hAnsi="Times New Roman" w:cs="Times New Roman"/>
@@ -5917,9 +6915,9 @@
           <w:szCs w:val="24"/>
           <w:lang w:val="fr-FR"/>
         </w:rPr>
-        <w:lastRenderedPageBreak/>
-        <w:t>et al.);</w:t>
-      </w:r>
+        <w:t>with</w:t>
+      </w:r>
+      <w:proofErr w:type="spellEnd"/>
       <w:r>
         <w:rPr>
           <w:rFonts w:ascii="Times New Roman" w:hAnsi="Times New Roman" w:cs="Times New Roman"/>
@@ -5927,6 +6925,26 @@
           <w:szCs w:val="24"/>
           <w:lang w:val="fr-FR"/>
         </w:rPr>
+        <w:t xml:space="preserve"> R. Salomon et al.</w:t>
+      </w:r>
+      <w:proofErr w:type="gramStart"/>
+      <w:r>
+        <w:rPr>
+          <w:rFonts w:ascii="Times New Roman" w:hAnsi="Times New Roman" w:cs="Times New Roman"/>
+          <w:sz w:val="24"/>
+          <w:szCs w:val="24"/>
+          <w:lang w:val="fr-FR"/>
+        </w:rPr>
+        <w:t>);</w:t>
+      </w:r>
+      <w:proofErr w:type="gramEnd"/>
+      <w:r>
+        <w:rPr>
+          <w:rFonts w:ascii="Times New Roman" w:hAnsi="Times New Roman" w:cs="Times New Roman"/>
+          <w:sz w:val="24"/>
+          <w:szCs w:val="24"/>
+          <w:lang w:val="fr-FR"/>
+        </w:rPr>
         <w:t xml:space="preserve"> </w:t>
       </w:r>
       <w:r>
@@ -5946,8 +6964,9 @@
           <w:szCs w:val="24"/>
           <w:lang w:val="fr-FR"/>
         </w:rPr>
-        <w:t>, Paris 1991;</w:t>
-      </w:r>
+        <w:t xml:space="preserve">, Paris </w:t>
+      </w:r>
+      <w:proofErr w:type="gramStart"/>
       <w:r>
         <w:rPr>
           <w:rFonts w:ascii="Times New Roman" w:hAnsi="Times New Roman" w:cs="Times New Roman"/>
@@ -5955,6 +6974,16 @@
           <w:szCs w:val="24"/>
           <w:lang w:val="fr-FR"/>
         </w:rPr>
+        <w:t>1991;</w:t>
+      </w:r>
+      <w:proofErr w:type="gramEnd"/>
+      <w:r>
+        <w:rPr>
+          <w:rFonts w:ascii="Times New Roman" w:hAnsi="Times New Roman" w:cs="Times New Roman"/>
+          <w:sz w:val="24"/>
+          <w:szCs w:val="24"/>
+          <w:lang w:val="fr-FR"/>
+        </w:rPr>
         <w:t xml:space="preserve"> </w:t>
       </w:r>
       <w:r>
@@ -5984,8 +7013,9 @@
           <w:szCs w:val="24"/>
           <w:lang w:val="fr-FR"/>
         </w:rPr>
-        <w:t>, Paris 1994;</w:t>
-      </w:r>
+        <w:t xml:space="preserve">, Paris </w:t>
+      </w:r>
+      <w:proofErr w:type="gramStart"/>
       <w:r>
         <w:rPr>
           <w:rFonts w:ascii="Times New Roman" w:hAnsi="Times New Roman" w:cs="Times New Roman"/>
@@ -5993,6 +7023,16 @@
           <w:szCs w:val="24"/>
           <w:lang w:val="fr-FR"/>
         </w:rPr>
+        <w:t>1994;</w:t>
+      </w:r>
+      <w:proofErr w:type="gramEnd"/>
+      <w:r>
+        <w:rPr>
+          <w:rFonts w:ascii="Times New Roman" w:hAnsi="Times New Roman" w:cs="Times New Roman"/>
+          <w:sz w:val="24"/>
+          <w:szCs w:val="24"/>
+          <w:lang w:val="fr-FR"/>
+        </w:rPr>
         <w:t xml:space="preserve"> </w:t>
       </w:r>
       <w:r>
@@ -6106,8 +7146,9 @@
           <w:szCs w:val="24"/>
           <w:lang w:val="fr-FR"/>
         </w:rPr>
-        <w:t xml:space="preserve">The Evolution of the </w:t>
-      </w:r>
+        <w:t xml:space="preserve">The </w:t>
+      </w:r>
+      <w:proofErr w:type="spellStart"/>
       <w:r>
         <w:rPr>
           <w:rFonts w:ascii="Times New Roman" w:hAnsi="Times New Roman" w:cs="Times New Roman"/>
@@ -6116,6 +7157,27 @@
           <w:szCs w:val="24"/>
           <w:lang w:val="fr-FR"/>
         </w:rPr>
+        <w:t>Evolution</w:t>
+      </w:r>
+      <w:proofErr w:type="spellEnd"/>
+      <w:r>
+        <w:rPr>
+          <w:rFonts w:ascii="Times New Roman" w:hAnsi="Times New Roman" w:cs="Times New Roman"/>
+          <w:i/>
+          <w:sz w:val="24"/>
+          <w:szCs w:val="24"/>
+          <w:lang w:val="fr-FR"/>
+        </w:rPr>
+        <w:t xml:space="preserve"> of the </w:t>
+      </w:r>
+      <w:r>
+        <w:rPr>
+          <w:rFonts w:ascii="Times New Roman" w:hAnsi="Times New Roman" w:cs="Times New Roman"/>
+          <w:i/>
+          <w:sz w:val="24"/>
+          <w:szCs w:val="24"/>
+          <w:lang w:val="fr-FR"/>
+        </w:rPr>
         <w:t>International Financial System</w:t>
       </w:r>
       <w:r>
@@ -6125,8 +7187,9 @@
           <w:szCs w:val="24"/>
           <w:lang w:val="fr-FR"/>
         </w:rPr>
-        <w:t xml:space="preserve">, paper </w:t>
-      </w:r>
+        <w:t xml:space="preserve">, </w:t>
+      </w:r>
+      <w:proofErr w:type="spellStart"/>
       <w:r>
         <w:rPr>
           <w:rFonts w:ascii="Times New Roman" w:hAnsi="Times New Roman" w:cs="Times New Roman"/>
@@ -6134,6 +7197,25 @@
           <w:szCs w:val="24"/>
           <w:lang w:val="fr-FR"/>
         </w:rPr>
+        <w:t>paper</w:t>
+      </w:r>
+      <w:proofErr w:type="spellEnd"/>
+      <w:r>
+        <w:rPr>
+          <w:rFonts w:ascii="Times New Roman" w:hAnsi="Times New Roman" w:cs="Times New Roman"/>
+          <w:sz w:val="24"/>
+          <w:szCs w:val="24"/>
+          <w:lang w:val="fr-FR"/>
+        </w:rPr>
+        <w:t xml:space="preserve"> </w:t>
+      </w:r>
+      <w:r>
+        <w:rPr>
+          <w:rFonts w:ascii="Times New Roman" w:hAnsi="Times New Roman" w:cs="Times New Roman"/>
+          <w:sz w:val="24"/>
+          <w:szCs w:val="24"/>
+          <w:lang w:val="fr-FR"/>
+        </w:rPr>
         <w:t>May 2002</w:t>
       </w:r>
       <w:r>
@@ -6143,9 +7225,29 @@
           <w:szCs w:val="24"/>
           <w:lang w:val="fr-FR"/>
         </w:rPr>
-        <w:t xml:space="preserve">, available at </w:t>
-      </w:r>
-      <w:hyperlink r:id="rId8" w:history="1">
+        <w:t xml:space="preserve">, </w:t>
+      </w:r>
+      <w:proofErr w:type="spellStart"/>
+      <w:r>
+        <w:rPr>
+          <w:rFonts w:ascii="Times New Roman" w:hAnsi="Times New Roman" w:cs="Times New Roman"/>
+          <w:sz w:val="24"/>
+          <w:szCs w:val="24"/>
+          <w:lang w:val="fr-FR"/>
+        </w:rPr>
+        <w:t>available</w:t>
+      </w:r>
+      <w:proofErr w:type="spellEnd"/>
+      <w:r>
+        <w:rPr>
+          <w:rFonts w:ascii="Times New Roman" w:hAnsi="Times New Roman" w:cs="Times New Roman"/>
+          <w:sz w:val="24"/>
+          <w:szCs w:val="24"/>
+          <w:lang w:val="fr-FR"/>
+        </w:rPr>
+        <w:t xml:space="preserve"> at </w:t>
+      </w:r>
+      <w:hyperlink r:id="rId7" w:history="1">
         <w:r>
           <w:rPr>
             <w:rStyle w:val="Hyperlink"/>
@@ -6183,8 +7285,9 @@
           <w:szCs w:val="24"/>
           <w:lang w:val="fr-FR"/>
         </w:rPr>
-        <w:t>‘How Should the IMF B</w:t>
-      </w:r>
+        <w:t xml:space="preserve">‘How </w:t>
+      </w:r>
+      <w:proofErr w:type="spellStart"/>
       <w:r>
         <w:rPr>
           <w:rFonts w:ascii="Times New Roman" w:hAnsi="Times New Roman" w:cs="Times New Roman"/>
@@ -6192,8 +7295,9 @@
           <w:szCs w:val="24"/>
           <w:lang w:val="fr-FR"/>
         </w:rPr>
-        <w:t>e Reshaped?’ in</w:t>
-      </w:r>
+        <w:t>Should</w:t>
+      </w:r>
+      <w:proofErr w:type="spellEnd"/>
       <w:r>
         <w:rPr>
           <w:rFonts w:ascii="Times New Roman" w:hAnsi="Times New Roman" w:cs="Times New Roman"/>
@@ -6201,6 +7305,44 @@
           <w:szCs w:val="24"/>
           <w:lang w:val="fr-FR"/>
         </w:rPr>
+        <w:t xml:space="preserve"> the IMF B</w:t>
+      </w:r>
+      <w:r>
+        <w:rPr>
+          <w:rFonts w:ascii="Times New Roman" w:hAnsi="Times New Roman" w:cs="Times New Roman"/>
+          <w:sz w:val="24"/>
+          <w:szCs w:val="24"/>
+          <w:lang w:val="fr-FR"/>
+        </w:rPr>
+        <w:t xml:space="preserve">e </w:t>
+      </w:r>
+      <w:proofErr w:type="spellStart"/>
+      <w:r>
+        <w:rPr>
+          <w:rFonts w:ascii="Times New Roman" w:hAnsi="Times New Roman" w:cs="Times New Roman"/>
+          <w:sz w:val="24"/>
+          <w:szCs w:val="24"/>
+          <w:lang w:val="fr-FR"/>
+        </w:rPr>
+        <w:t>Reshaped</w:t>
+      </w:r>
+      <w:proofErr w:type="spellEnd"/>
+      <w:r>
+        <w:rPr>
+          <w:rFonts w:ascii="Times New Roman" w:hAnsi="Times New Roman" w:cs="Times New Roman"/>
+          <w:sz w:val="24"/>
+          <w:szCs w:val="24"/>
+          <w:lang w:val="fr-FR"/>
+        </w:rPr>
+        <w:t>?’ in</w:t>
+      </w:r>
+      <w:r>
+        <w:rPr>
+          <w:rFonts w:ascii="Times New Roman" w:hAnsi="Times New Roman" w:cs="Times New Roman"/>
+          <w:sz w:val="24"/>
+          <w:szCs w:val="24"/>
+          <w:lang w:val="fr-FR"/>
+        </w:rPr>
         <w:t xml:space="preserve"> </w:t>
       </w:r>
       <w:r>
@@ -6211,15 +7353,27 @@
           <w:szCs w:val="24"/>
           <w:lang w:val="fr-FR"/>
         </w:rPr>
-        <w:t>Finance &amp; Development</w:t>
-      </w:r>
-      <w:r>
-        <w:rPr>
-          <w:rFonts w:ascii="Times New Roman" w:hAnsi="Times New Roman" w:cs="Times New Roman"/>
+        <w:t xml:space="preserve">Finance &amp; </w:t>
+      </w:r>
+      <w:proofErr w:type="spellStart"/>
+      <w:r>
+        <w:rPr>
+          <w:rFonts w:ascii="Times New Roman" w:hAnsi="Times New Roman" w:cs="Times New Roman"/>
+          <w:i/>
           <w:sz w:val="24"/>
           <w:szCs w:val="24"/>
           <w:lang w:val="fr-FR"/>
         </w:rPr>
+        <w:t>Development</w:t>
+      </w:r>
+      <w:proofErr w:type="spellEnd"/>
+      <w:r>
+        <w:rPr>
+          <w:rFonts w:ascii="Times New Roman" w:hAnsi="Times New Roman" w:cs="Times New Roman"/>
+          <w:sz w:val="24"/>
+          <w:szCs w:val="24"/>
+          <w:lang w:val="fr-FR"/>
+        </w:rPr>
         <w:t>, September 2004, 27-29;</w:t>
       </w:r>
       <w:r>
@@ -6260,6 +7414,7 @@
         </w:rPr>
         <w:t xml:space="preserve">, </w:t>
       </w:r>
+      <w:proofErr w:type="spellStart"/>
       <w:r>
         <w:rPr>
           <w:rFonts w:ascii="Times New Roman" w:hAnsi="Times New Roman" w:cs="Times New Roman"/>
@@ -6267,8 +7422,9 @@
           <w:szCs w:val="24"/>
           <w:lang w:val="fr-FR"/>
         </w:rPr>
-        <w:t>paper 25 March 2007</w:t>
-      </w:r>
+        <w:t>paper</w:t>
+      </w:r>
+      <w:proofErr w:type="spellEnd"/>
       <w:r>
         <w:rPr>
           <w:rFonts w:ascii="Times New Roman" w:hAnsi="Times New Roman" w:cs="Times New Roman"/>
@@ -6276,6 +7432,15 @@
           <w:szCs w:val="24"/>
           <w:lang w:val="fr-FR"/>
         </w:rPr>
+        <w:t xml:space="preserve"> 25 March 2007</w:t>
+      </w:r>
+      <w:r>
+        <w:rPr>
+          <w:rFonts w:ascii="Times New Roman" w:hAnsi="Times New Roman" w:cs="Times New Roman"/>
+          <w:sz w:val="24"/>
+          <w:szCs w:val="24"/>
+          <w:lang w:val="fr-FR"/>
+        </w:rPr>
         <w:t xml:space="preserve">, </w:t>
       </w:r>
       <w:r>
@@ -6366,7 +7531,7 @@
         </w:rPr>
         <w:t xml:space="preserve"> </w:t>
       </w:r>
-      <w:hyperlink r:id="rId9" w:history="1">
+      <w:hyperlink r:id="rId8" w:history="1">
         <w:r>
           <w:rPr>
             <w:rStyle w:val="Hyperlink"/>
@@ -6411,7 +7576,7 @@
         </w:rPr>
         <w:t xml:space="preserve">, Speech delivered at Columbia University, 1 December 2010, available at </w:t>
       </w:r>
-      <w:hyperlink r:id="rId10" w:history="1">
+      <w:hyperlink r:id="rId9" w:history="1">
         <w:r>
           <w:rPr>
             <w:rStyle w:val="Hyperlink"/>
@@ -6446,8 +7611,9 @@
           <w:sz w:val="24"/>
           <w:szCs w:val="24"/>
         </w:rPr>
-        <w:t>‘Le hazard ou l’alé</w:t>
-      </w:r>
+        <w:t xml:space="preserve">‘Le hazard </w:t>
+      </w:r>
+      <w:proofErr w:type="spellStart"/>
       <w:r>
         <w:rPr>
           <w:rFonts w:ascii="Times New Roman" w:hAnsi="Times New Roman" w:cs="Times New Roman"/>
@@ -6455,7 +7621,66 @@
           <w:sz w:val="24"/>
           <w:szCs w:val="24"/>
         </w:rPr>
-        <w:t>a moral’. Une communication a l’Académie des Sciences Morales et Politiques</w:t>
+        <w:t>ou</w:t>
+      </w:r>
+      <w:proofErr w:type="spellEnd"/>
+      <w:r>
+        <w:rPr>
+          <w:rFonts w:ascii="Times New Roman" w:hAnsi="Times New Roman" w:cs="Times New Roman"/>
+          <w:i/>
+          <w:sz w:val="24"/>
+          <w:szCs w:val="24"/>
+        </w:rPr>
+        <w:t xml:space="preserve"> </w:t>
+      </w:r>
+      <w:proofErr w:type="spellStart"/>
+      <w:r>
+        <w:rPr>
+          <w:rFonts w:ascii="Times New Roman" w:hAnsi="Times New Roman" w:cs="Times New Roman"/>
+          <w:i/>
+          <w:sz w:val="24"/>
+          <w:szCs w:val="24"/>
+        </w:rPr>
+        <w:t>l’alé</w:t>
+      </w:r>
+      <w:r>
+        <w:rPr>
+          <w:rFonts w:ascii="Times New Roman" w:hAnsi="Times New Roman" w:cs="Times New Roman"/>
+          <w:i/>
+          <w:sz w:val="24"/>
+          <w:szCs w:val="24"/>
+        </w:rPr>
+        <w:t>a</w:t>
+      </w:r>
+      <w:proofErr w:type="spellEnd"/>
+      <w:r>
+        <w:rPr>
+          <w:rFonts w:ascii="Times New Roman" w:hAnsi="Times New Roman" w:cs="Times New Roman"/>
+          <w:i/>
+          <w:sz w:val="24"/>
+          <w:szCs w:val="24"/>
+        </w:rPr>
+        <w:t xml:space="preserve"> moral’. Une communication a </w:t>
+      </w:r>
+      <w:proofErr w:type="spellStart"/>
+      <w:r>
+        <w:rPr>
+          <w:rFonts w:ascii="Times New Roman" w:hAnsi="Times New Roman" w:cs="Times New Roman"/>
+          <w:i/>
+          <w:sz w:val="24"/>
+          <w:szCs w:val="24"/>
+        </w:rPr>
+        <w:t>l’Académie</w:t>
+      </w:r>
+      <w:proofErr w:type="spellEnd"/>
+      <w:r>
+        <w:rPr>
+          <w:rFonts w:ascii="Times New Roman" w:hAnsi="Times New Roman" w:cs="Times New Roman"/>
+          <w:i/>
+          <w:sz w:val="24"/>
+          <w:szCs w:val="24"/>
+        </w:rPr>
+        <w:t xml:space="preserve"> des Sciences Morales et Politiques</w:t>
       </w:r>
       <w:r>
         <w:rPr>
@@ -6505,7 +7730,25 @@
           <w:sz w:val="24"/>
           <w:szCs w:val="24"/>
         </w:rPr>
-        <w:t xml:space="preserve"> (with A.-M. Idrac et al.), </w:t>
+        <w:t xml:space="preserve"> (with A.-M. </w:t>
+      </w:r>
+      <w:proofErr w:type="spellStart"/>
+      <w:r>
+        <w:rPr>
+          <w:rFonts w:ascii="Times New Roman" w:hAnsi="Times New Roman" w:cs="Times New Roman"/>
+          <w:sz w:val="24"/>
+          <w:szCs w:val="24"/>
+        </w:rPr>
+        <w:t>Idrac</w:t>
+      </w:r>
+      <w:proofErr w:type="spellEnd"/>
+      <w:r>
+        <w:rPr>
+          <w:rFonts w:ascii="Times New Roman" w:hAnsi="Times New Roman" w:cs="Times New Roman"/>
+          <w:sz w:val="24"/>
+          <w:szCs w:val="24"/>
+        </w:rPr>
+        <w:t xml:space="preserve"> et al.), </w:t>
       </w:r>
       <w:r>
         <w:rPr>
@@ -6515,7 +7758,7 @@
         </w:rPr>
         <w:t xml:space="preserve">available at </w:t>
       </w:r>
-      <w:hyperlink r:id="rId11" w:history="1">
+      <w:hyperlink r:id="rId10" w:history="1">
         <w:r>
           <w:rPr>
             <w:rStyle w:val="Hyperlink"/>
@@ -6592,6 +7835,7 @@
         </w:rPr>
         <w:t xml:space="preserve"> </w:t>
       </w:r>
+      <w:proofErr w:type="spellStart"/>
       <w:r>
         <w:rPr>
           <w:rFonts w:ascii="Times New Roman" w:hAnsi="Times New Roman" w:cs="Times New Roman"/>
@@ -6600,7 +7844,40 @@
           <w:sz w:val="24"/>
           <w:szCs w:val="24"/>
         </w:rPr>
-        <w:t>Recréer le système international</w:t>
+        <w:t>Recréer</w:t>
+      </w:r>
+      <w:proofErr w:type="spellEnd"/>
+      <w:r>
+        <w:rPr>
+          <w:rFonts w:ascii="Times New Roman" w:hAnsi="Times New Roman" w:cs="Times New Roman"/>
+          <w:i/>
+          <w:color w:val="000000" w:themeColor="text1"/>
+          <w:sz w:val="24"/>
+          <w:szCs w:val="24"/>
+        </w:rPr>
+        <w:t xml:space="preserve"> le </w:t>
+      </w:r>
+      <w:proofErr w:type="spellStart"/>
+      <w:r>
+        <w:rPr>
+          <w:rFonts w:ascii="Times New Roman" w:hAnsi="Times New Roman" w:cs="Times New Roman"/>
+          <w:i/>
+          <w:color w:val="000000" w:themeColor="text1"/>
+          <w:sz w:val="24"/>
+          <w:szCs w:val="24"/>
+        </w:rPr>
+        <w:t>système</w:t>
+      </w:r>
+      <w:proofErr w:type="spellEnd"/>
+      <w:r>
+        <w:rPr>
+          <w:rFonts w:ascii="Times New Roman" w:hAnsi="Times New Roman" w:cs="Times New Roman"/>
+          <w:i/>
+          <w:color w:val="000000" w:themeColor="text1"/>
+          <w:sz w:val="24"/>
+          <w:szCs w:val="24"/>
+        </w:rPr>
+        <w:t xml:space="preserve"> international</w:t>
       </w:r>
       <w:r>
         <w:rPr>
@@ -6804,7 +8081,25 @@
           <w:sz w:val="24"/>
           <w:szCs w:val="24"/>
         </w:rPr>
-        <w:t>essed by a World Financial Crisis De Larosière Has Turned the F</w:t>
+        <w:t xml:space="preserve">essed by a World Financial Crisis De </w:t>
+      </w:r>
+      <w:proofErr w:type="spellStart"/>
+      <w:r>
+        <w:rPr>
+          <w:rFonts w:ascii="Times New Roman" w:hAnsi="Times New Roman" w:cs="Times New Roman"/>
+          <w:sz w:val="24"/>
+          <w:szCs w:val="24"/>
+        </w:rPr>
+        <w:t>Larosière</w:t>
+      </w:r>
+      <w:proofErr w:type="spellEnd"/>
+      <w:r>
+        <w:rPr>
+          <w:rFonts w:ascii="Times New Roman" w:hAnsi="Times New Roman" w:cs="Times New Roman"/>
+          <w:sz w:val="24"/>
+          <w:szCs w:val="24"/>
+        </w:rPr>
+        <w:t xml:space="preserve"> Has Turned the F</w:t>
       </w:r>
       <w:r>
         <w:rPr>
@@ -6976,7 +8271,25 @@
           <w:sz w:val="24"/>
           <w:szCs w:val="24"/>
         </w:rPr>
-        <w:t xml:space="preserve">De Larosière: </w:t>
+        <w:t xml:space="preserve">De </w:t>
+      </w:r>
+      <w:proofErr w:type="spellStart"/>
+      <w:r>
+        <w:rPr>
+          <w:rFonts w:ascii="Times New Roman" w:hAnsi="Times New Roman" w:cs="Times New Roman"/>
+          <w:sz w:val="24"/>
+          <w:szCs w:val="24"/>
+        </w:rPr>
+        <w:t>Larosière</w:t>
+      </w:r>
+      <w:proofErr w:type="spellEnd"/>
+      <w:r>
+        <w:rPr>
+          <w:rFonts w:ascii="Times New Roman" w:hAnsi="Times New Roman" w:cs="Times New Roman"/>
+          <w:sz w:val="24"/>
+          <w:szCs w:val="24"/>
+        </w:rPr>
+        <w:t xml:space="preserve">: </w:t>
       </w:r>
       <w:r>
         <w:rPr>
@@ -7106,7 +8419,43 @@
           <w:sz w:val="24"/>
           <w:szCs w:val="24"/>
         </w:rPr>
-        <w:t>‘L’Austère de Larosière’ in</w:t>
+        <w:t>‘</w:t>
+      </w:r>
+      <w:proofErr w:type="spellStart"/>
+      <w:r>
+        <w:rPr>
+          <w:rFonts w:ascii="Times New Roman" w:hAnsi="Times New Roman" w:cs="Times New Roman"/>
+          <w:sz w:val="24"/>
+          <w:szCs w:val="24"/>
+        </w:rPr>
+        <w:t>L’Austère</w:t>
+      </w:r>
+      <w:proofErr w:type="spellEnd"/>
+      <w:r>
+        <w:rPr>
+          <w:rFonts w:ascii="Times New Roman" w:hAnsi="Times New Roman" w:cs="Times New Roman"/>
+          <w:sz w:val="24"/>
+          <w:szCs w:val="24"/>
+        </w:rPr>
+        <w:t xml:space="preserve"> de </w:t>
+      </w:r>
+      <w:proofErr w:type="spellStart"/>
+      <w:r>
+        <w:rPr>
+          <w:rFonts w:ascii="Times New Roman" w:hAnsi="Times New Roman" w:cs="Times New Roman"/>
+          <w:sz w:val="24"/>
+          <w:szCs w:val="24"/>
+        </w:rPr>
+        <w:t>Larosière</w:t>
+      </w:r>
+      <w:proofErr w:type="spellEnd"/>
+      <w:r>
+        <w:rPr>
+          <w:rFonts w:ascii="Times New Roman" w:hAnsi="Times New Roman" w:cs="Times New Roman"/>
+          <w:sz w:val="24"/>
+          <w:szCs w:val="24"/>
+        </w:rPr>
+        <w:t>’ in</w:t>
       </w:r>
       <w:r>
         <w:rPr>
@@ -7253,7 +8602,25 @@
           <w:sz w:val="24"/>
           <w:szCs w:val="24"/>
         </w:rPr>
-        <w:t>De Larosière to H</w:t>
+        <w:t xml:space="preserve">De </w:t>
+      </w:r>
+      <w:proofErr w:type="spellStart"/>
+      <w:r>
+        <w:rPr>
+          <w:rFonts w:ascii="Times New Roman" w:hAnsi="Times New Roman" w:cs="Times New Roman"/>
+          <w:sz w:val="24"/>
+          <w:szCs w:val="24"/>
+        </w:rPr>
+        <w:t>Larosière</w:t>
+      </w:r>
+      <w:proofErr w:type="spellEnd"/>
+      <w:r>
+        <w:rPr>
+          <w:rFonts w:ascii="Times New Roman" w:hAnsi="Times New Roman" w:cs="Times New Roman"/>
+          <w:sz w:val="24"/>
+          <w:szCs w:val="24"/>
+        </w:rPr>
+        <w:t xml:space="preserve"> to H</w:t>
       </w:r>
       <w:r>
         <w:rPr>
@@ -7747,7 +9114,25 @@
           <w:sz w:val="24"/>
           <w:szCs w:val="24"/>
         </w:rPr>
-        <w:t xml:space="preserve">: Jacques de Larosiere – </w:t>
+        <w:t xml:space="preserve">: Jacques de </w:t>
+      </w:r>
+      <w:proofErr w:type="spellStart"/>
+      <w:r>
+        <w:rPr>
+          <w:rFonts w:ascii="Times New Roman" w:hAnsi="Times New Roman" w:cs="Times New Roman"/>
+          <w:sz w:val="24"/>
+          <w:szCs w:val="24"/>
+        </w:rPr>
+        <w:t>Larosiere</w:t>
+      </w:r>
+      <w:proofErr w:type="spellEnd"/>
+      <w:r>
+        <w:rPr>
+          <w:rFonts w:ascii="Times New Roman" w:hAnsi="Times New Roman" w:cs="Times New Roman"/>
+          <w:sz w:val="24"/>
+          <w:szCs w:val="24"/>
+        </w:rPr>
+        <w:t xml:space="preserve"> – </w:t>
       </w:r>
       <w:r>
         <w:rPr>
@@ -8082,7 +9467,7 @@
         </w:rPr>
         <w:t xml:space="preserve"> </w:t>
       </w:r>
-      <w:hyperlink r:id="rId12" w:history="1">
+      <w:hyperlink r:id="rId11" w:history="1">
         <w:r>
           <w:rPr>
             <w:rStyle w:val="Hyperlink"/>
@@ -8118,7 +9503,7 @@
         </w:rPr>
         <w:t xml:space="preserve">Group of Thirty, ‘Jacques de Larosière’, available at </w:t>
       </w:r>
-      <w:hyperlink r:id="rId13" w:history="1">
+      <w:hyperlink r:id="rId12" w:history="1">
         <w:r>
           <w:rPr>
             <w:rStyle w:val="Hyperlink"/>
@@ -8145,7 +9530,27 @@
           <w:sz w:val="24"/>
           <w:szCs w:val="24"/>
         </w:rPr>
-        <w:t>Notice biographique de Jacques de Larosière</w:t>
+        <w:t xml:space="preserve">Notice </w:t>
+      </w:r>
+      <w:proofErr w:type="spellStart"/>
+      <w:r>
+        <w:rPr>
+          <w:rFonts w:ascii="Times New Roman" w:hAnsi="Times New Roman" w:cs="Times New Roman"/>
+          <w:i/>
+          <w:sz w:val="24"/>
+          <w:szCs w:val="24"/>
+        </w:rPr>
+        <w:t>biographique</w:t>
+      </w:r>
+      <w:proofErr w:type="spellEnd"/>
+      <w:r>
+        <w:rPr>
+          <w:rFonts w:ascii="Times New Roman" w:hAnsi="Times New Roman" w:cs="Times New Roman"/>
+          <w:i/>
+          <w:sz w:val="24"/>
+          <w:szCs w:val="24"/>
+        </w:rPr>
+        <w:t xml:space="preserve"> de Jacques de Larosière</w:t>
       </w:r>
       <w:r>
         <w:rPr>
@@ -8155,7 +9560,7 @@
         </w:rPr>
         <w:t xml:space="preserve">, 23 May 2013, available at </w:t>
       </w:r>
-      <w:hyperlink r:id="rId14" w:history="1">
+      <w:hyperlink r:id="rId13" w:history="1">
         <w:r>
           <w:rPr>
             <w:rStyle w:val="Hyperlink"/>
@@ -8252,7 +9657,7 @@
         </w:rPr>
         <w:t xml:space="preserve">2015, available at </w:t>
       </w:r>
-      <w:hyperlink r:id="rId15" w:history="1">
+      <w:hyperlink r:id="rId14" w:history="1">
         <w:r>
           <w:rPr>
             <w:rStyle w:val="Hyperlink"/>
@@ -8438,8 +9843,27 @@
           <w:sz w:val="24"/>
           <w:szCs w:val="24"/>
         </w:rPr>
-        <w:lastRenderedPageBreak/>
-        <w:t>May 2021: added that in 1987 Camdessus became IMF Managing Director</w:t>
+        <w:t xml:space="preserve">May 2021: added that in 1987 </w:t>
+      </w:r>
+      <w:proofErr w:type="spellStart"/>
+      <w:r>
+        <w:rPr>
+          <w:rFonts w:ascii="Times New Roman" w:hAnsi="Times New Roman" w:cs="Times New Roman"/>
+          <w:bCs/>
+          <w:sz w:val="24"/>
+          <w:szCs w:val="24"/>
+        </w:rPr>
+        <w:t>Camdessus</w:t>
+      </w:r>
+      <w:proofErr w:type="spellEnd"/>
+      <w:r>
+        <w:rPr>
+          <w:rFonts w:ascii="Times New Roman" w:hAnsi="Times New Roman" w:cs="Times New Roman"/>
+          <w:bCs/>
+          <w:sz w:val="24"/>
+          <w:szCs w:val="24"/>
+        </w:rPr>
+        <w:t xml:space="preserve"> became IMF Managing Director</w:t>
       </w:r>
     </w:p>
     <w:p>
@@ -8491,7 +9915,25 @@
           <w:sz w:val="24"/>
           <w:szCs w:val="24"/>
         </w:rPr>
-        <w:t>Kendall W. Stiles, ‘De Larosière, Ja</w:t>
+        <w:t xml:space="preserve">Kendall W. Stiles, ‘De </w:t>
+      </w:r>
+      <w:proofErr w:type="spellStart"/>
+      <w:r>
+        <w:rPr>
+          <w:rFonts w:ascii="Times New Roman" w:hAnsi="Times New Roman" w:cs="Times New Roman"/>
+          <w:sz w:val="24"/>
+          <w:szCs w:val="24"/>
+        </w:rPr>
+        <w:t>Larosière</w:t>
+      </w:r>
+      <w:proofErr w:type="spellEnd"/>
+      <w:r>
+        <w:rPr>
+          <w:rFonts w:ascii="Times New Roman" w:hAnsi="Times New Roman" w:cs="Times New Roman"/>
+          <w:sz w:val="24"/>
+          <w:szCs w:val="24"/>
+        </w:rPr>
+        <w:t>, Ja</w:t>
       </w:r>
       <w:r>
         <w:rPr>
@@ -8542,7 +9984,7 @@
         </w:rPr>
         <w:t xml:space="preserve">Eisenberg, </w:t>
       </w:r>
-      <w:hyperlink r:id="rId16" w:history="1">
+      <w:hyperlink r:id="rId15" w:history="1">
         <w:r>
           <w:rPr>
             <w:rStyle w:val="Hyperlink"/>
@@ -8576,9 +10018,9 @@
       </w:pPr>
     </w:p>
     <w:sectPr>
-      <w:headerReference w:type="even" r:id="rId17"/>
-      <w:headerReference w:type="default" r:id="rId18"/>
-      <w:footerReference w:type="default" r:id="rId19"/>
+      <w:headerReference w:type="even" r:id="rId16"/>
+      <w:headerReference w:type="default" r:id="rId17"/>
+      <w:footerReference w:type="default" r:id="rId18"/>
       <w:pgSz w:w="11901" w:h="16840"/>
       <w:pgMar w:top="1418" w:right="1418" w:bottom="1418" w:left="1418" w:header="709" w:footer="709" w:gutter="0"/>
       <w:cols w:space="720"/>
@@ -8589,7 +10031,7 @@
 </file>
 
 <file path=word/endnotes.xml><?xml version="1.0" encoding="utf-8"?>
-<w:endnotes xmlns:wpc="http://schemas.microsoft.com/office/word/2010/wordprocessingCanvas" xmlns:cx="http://schemas.microsoft.com/office/drawing/2014/chartex" xmlns:cx1="http://schemas.microsoft.com/office/drawing/2015/9/8/chartex" xmlns:cx2="http://schemas.microsoft.com/office/drawing/2015/10/21/chartex" xmlns:cx3="http://schemas.microsoft.com/office/drawing/2016/5/9/chartex" xmlns:cx4="http://schemas.microsoft.com/office/drawing/2016/5/10/chartex" xmlns:cx5="http://schemas.microsoft.com/office/drawing/2016/5/11/chartex" xmlns:cx6="http://schemas.microsoft.com/office/drawing/2016/5/12/chartex" xmlns:cx7="http://schemas.microsoft.com/office/drawing/2016/5/13/chartex" xmlns:cx8="http://schemas.microsoft.com/office/drawing/2016/5/14/chartex" xmlns:mc="http://schemas.openxmlformats.org/markup-compatibility/2006" xmlns:aink="http://schemas.microsoft.com/office/drawing/2016/ink" xmlns:am3d="http://schemas.microsoft.com/office/drawing/2017/model3d" xmlns:o="urn:schemas-microsoft-com:office:office" xmlns:oel="http://schemas.microsoft.com/office/2019/extlst" xmlns:r="http://schemas.openxmlformats.org/officeDocument/2006/relationships" xmlns:m="http://schemas.openxmlformats.org/officeDocument/2006/math" xmlns:v="urn:schemas-microsoft-com:vml" xmlns:wp14="http://schemas.microsoft.com/office/word/2010/wordprocessingDrawing" xmlns:wp="http://schemas.openxmlformats.org/drawingml/2006/wordprocessingDrawing" xmlns:w10="urn:schemas-microsoft-com:office:word" xmlns:w="http://schemas.openxmlformats.org/wordprocessingml/2006/main" xmlns:w14="http://schemas.microsoft.com/office/word/2010/wordml" xmlns:w15="http://schemas.microsoft.com/office/word/2012/wordml" xmlns:w16cex="http://schemas.microsoft.com/office/word/2018/wordml/cex" xmlns:w16cid="http://schemas.microsoft.com/office/word/2016/wordml/cid" xmlns:w16="http://schemas.microsoft.com/office/word/2018/wordml" xmlns:w16du="http://schemas.microsoft.com/office/word/2023/wordml/word16du" xmlns:w16sdtdh="http://schemas.microsoft.com/office/word/2020/wordml/sdtdatahash" xmlns:w16sdtfl="http://schemas.microsoft.com/office/word/2024/wordml/sdtformatlock" xmlns:w16se="http://schemas.microsoft.com/office/word/2015/wordml/symex" xmlns:wpg="http://schemas.microsoft.com/office/word/2010/wordprocessingGroup" xmlns:wpi="http://schemas.microsoft.com/office/word/2010/wordprocessingInk" xmlns:wne="http://schemas.microsoft.com/office/word/2006/wordml" xmlns:wps="http://schemas.microsoft.com/office/word/2010/wordprocessingShape" mc:Ignorable="w14 w15 w16se w16cid w16 w16cex w16sdtdh w16sdtfl w16du wp14">
+<w:endnotes xmlns:wpc="http://schemas.microsoft.com/office/word/2010/wordprocessingCanvas" xmlns:cx="http://schemas.microsoft.com/office/drawing/2014/chartex" xmlns:cx1="http://schemas.microsoft.com/office/drawing/2015/9/8/chartex" xmlns:cx2="http://schemas.microsoft.com/office/drawing/2015/10/21/chartex" xmlns:cx3="http://schemas.microsoft.com/office/drawing/2016/5/9/chartex" xmlns:cx4="http://schemas.microsoft.com/office/drawing/2016/5/10/chartex" xmlns:cx5="http://schemas.microsoft.com/office/drawing/2016/5/11/chartex" xmlns:cx6="http://schemas.microsoft.com/office/drawing/2016/5/12/chartex" xmlns:cx7="http://schemas.microsoft.com/office/drawing/2016/5/13/chartex" xmlns:cx8="http://schemas.microsoft.com/office/drawing/2016/5/14/chartex" xmlns:mc="http://schemas.openxmlformats.org/markup-compatibility/2006" xmlns:m="http://schemas.openxmlformats.org/officeDocument/2006/math" xmlns:aink="http://schemas.microsoft.com/office/drawing/2016/ink" xmlns:am3d="http://schemas.microsoft.com/office/drawing/2017/model3d" xmlns:oel="http://schemas.microsoft.com/office/2019/extlst" xmlns:r="http://schemas.openxmlformats.org/officeDocument/2006/relationships" xmlns:wp14="http://schemas.microsoft.com/office/word/2010/wordprocessingDrawing" xmlns:wp="http://schemas.openxmlformats.org/drawingml/2006/wordprocessingDrawing" xmlns:wpg="http://schemas.microsoft.com/office/word/2010/wordprocessingGroup" xmlns:wpi="http://schemas.microsoft.com/office/word/2010/wordprocessingInk" xmlns:wps="http://schemas.microsoft.com/office/word/2010/wordprocessingShape" xmlns:o="urn:schemas-microsoft-com:office:office" xmlns:v="urn:schemas-microsoft-com:vml" xmlns:w10="urn:schemas-microsoft-com:office:word" xmlns:w="http://schemas.openxmlformats.org/wordprocessingml/2006/main" xmlns:w14="http://schemas.microsoft.com/office/word/2010/wordml" xmlns:w15="http://schemas.microsoft.com/office/word/2012/wordml" xmlns:w16cei="http://schemas.microsoft.com/office/word/2026/wordml/cei" xmlns:w16cex="http://schemas.microsoft.com/office/word/2018/wordml/cex" xmlns:w16cid="http://schemas.microsoft.com/office/word/2016/wordml/cid" xmlns:w16="http://schemas.microsoft.com/office/word/2018/wordml" xmlns:w16sdtdh="http://schemas.microsoft.com/office/word/2020/wordml/sdtdatahash" xmlns:w16sdtfl="http://schemas.microsoft.com/office/word/2024/wordml/sdtformatlock" xmlns:w16se="http://schemas.microsoft.com/office/word/2015/wordml/symex" xmlns:w16du="http://schemas.microsoft.com/office/word/2023/wordml/word16du" xmlns:wne="http://schemas.microsoft.com/office/word/2006/wordml" mc:Ignorable="w14 w15 w16se w16cid w16 w16cex w16sdtdh w16sdtfl w16du wp14">
   <w:endnote w:type="separator" w:id="-1">
     <w:p>
       <w:pPr>
@@ -8614,7 +10056,7 @@
 </file>
 
 <file path=word/footer1.xml><?xml version="1.0" encoding="utf-8"?>
-<w:ftr xmlns:wpc="http://schemas.microsoft.com/office/word/2010/wordprocessingCanvas" xmlns:cx="http://schemas.microsoft.com/office/drawing/2014/chartex" xmlns:cx1="http://schemas.microsoft.com/office/drawing/2015/9/8/chartex" xmlns:cx2="http://schemas.microsoft.com/office/drawing/2015/10/21/chartex" xmlns:cx3="http://schemas.microsoft.com/office/drawing/2016/5/9/chartex" xmlns:cx4="http://schemas.microsoft.com/office/drawing/2016/5/10/chartex" xmlns:cx5="http://schemas.microsoft.com/office/drawing/2016/5/11/chartex" xmlns:cx6="http://schemas.microsoft.com/office/drawing/2016/5/12/chartex" xmlns:cx7="http://schemas.microsoft.com/office/drawing/2016/5/13/chartex" xmlns:cx8="http://schemas.microsoft.com/office/drawing/2016/5/14/chartex" xmlns:mc="http://schemas.openxmlformats.org/markup-compatibility/2006" xmlns:aink="http://schemas.microsoft.com/office/drawing/2016/ink" xmlns:am3d="http://schemas.microsoft.com/office/drawing/2017/model3d" xmlns:o="urn:schemas-microsoft-com:office:office" xmlns:oel="http://schemas.microsoft.com/office/2019/extlst" xmlns:r="http://schemas.openxmlformats.org/officeDocument/2006/relationships" xmlns:m="http://schemas.openxmlformats.org/officeDocument/2006/math" xmlns:v="urn:schemas-microsoft-com:vml" xmlns:wp14="http://schemas.microsoft.com/office/word/2010/wordprocessingDrawing" xmlns:wp="http://schemas.openxmlformats.org/drawingml/2006/wordprocessingDrawing" xmlns:w10="urn:schemas-microsoft-com:office:word" xmlns:w="http://schemas.openxmlformats.org/wordprocessingml/2006/main" xmlns:w14="http://schemas.microsoft.com/office/word/2010/wordml" xmlns:w15="http://schemas.microsoft.com/office/word/2012/wordml" xmlns:w16cex="http://schemas.microsoft.com/office/word/2018/wordml/cex" xmlns:w16cid="http://schemas.microsoft.com/office/word/2016/wordml/cid" xmlns:w16="http://schemas.microsoft.com/office/word/2018/wordml" xmlns:w16du="http://schemas.microsoft.com/office/word/2023/wordml/word16du" xmlns:w16sdtdh="http://schemas.microsoft.com/office/word/2020/wordml/sdtdatahash" xmlns:w16sdtfl="http://schemas.microsoft.com/office/word/2024/wordml/sdtformatlock" xmlns:w16se="http://schemas.microsoft.com/office/word/2015/wordml/symex" xmlns:wpg="http://schemas.microsoft.com/office/word/2010/wordprocessingGroup" xmlns:wpi="http://schemas.microsoft.com/office/word/2010/wordprocessingInk" xmlns:wne="http://schemas.microsoft.com/office/word/2006/wordml" xmlns:wps="http://schemas.microsoft.com/office/word/2010/wordprocessingShape" mc:Ignorable="w14 w15 w16se w16cid w16 w16cex w16sdtdh w16sdtfl w16du wp14">
+<w:ftr xmlns:wpc="http://schemas.microsoft.com/office/word/2010/wordprocessingCanvas" xmlns:cx="http://schemas.microsoft.com/office/drawing/2014/chartex" xmlns:cx1="http://schemas.microsoft.com/office/drawing/2015/9/8/chartex" xmlns:cx2="http://schemas.microsoft.com/office/drawing/2015/10/21/chartex" xmlns:cx3="http://schemas.microsoft.com/office/drawing/2016/5/9/chartex" xmlns:cx4="http://schemas.microsoft.com/office/drawing/2016/5/10/chartex" xmlns:cx5="http://schemas.microsoft.com/office/drawing/2016/5/11/chartex" xmlns:cx6="http://schemas.microsoft.com/office/drawing/2016/5/12/chartex" xmlns:cx7="http://schemas.microsoft.com/office/drawing/2016/5/13/chartex" xmlns:cx8="http://schemas.microsoft.com/office/drawing/2016/5/14/chartex" xmlns:mc="http://schemas.openxmlformats.org/markup-compatibility/2006" xmlns:m="http://schemas.openxmlformats.org/officeDocument/2006/math" xmlns:aink="http://schemas.microsoft.com/office/drawing/2016/ink" xmlns:am3d="http://schemas.microsoft.com/office/drawing/2017/model3d" xmlns:oel="http://schemas.microsoft.com/office/2019/extlst" xmlns:r="http://schemas.openxmlformats.org/officeDocument/2006/relationships" xmlns:wp14="http://schemas.microsoft.com/office/word/2010/wordprocessingDrawing" xmlns:wp="http://schemas.openxmlformats.org/drawingml/2006/wordprocessingDrawing" xmlns:wpg="http://schemas.microsoft.com/office/word/2010/wordprocessingGroup" xmlns:wpi="http://schemas.microsoft.com/office/word/2010/wordprocessingInk" xmlns:wps="http://schemas.microsoft.com/office/word/2010/wordprocessingShape" xmlns:o="urn:schemas-microsoft-com:office:office" xmlns:v="urn:schemas-microsoft-com:vml" xmlns:w10="urn:schemas-microsoft-com:office:word" xmlns:w="http://schemas.openxmlformats.org/wordprocessingml/2006/main" xmlns:w14="http://schemas.microsoft.com/office/word/2010/wordml" xmlns:w15="http://schemas.microsoft.com/office/word/2012/wordml" xmlns:w16cei="http://schemas.microsoft.com/office/word/2026/wordml/cei" xmlns:w16cex="http://schemas.microsoft.com/office/word/2018/wordml/cex" xmlns:w16cid="http://schemas.microsoft.com/office/word/2016/wordml/cid" xmlns:w16="http://schemas.microsoft.com/office/word/2018/wordml" xmlns:w16sdtdh="http://schemas.microsoft.com/office/word/2020/wordml/sdtdatahash" xmlns:w16sdtfl="http://schemas.microsoft.com/office/word/2024/wordml/sdtformatlock" xmlns:w16se="http://schemas.microsoft.com/office/word/2015/wordml/symex" xmlns:w16du="http://schemas.microsoft.com/office/word/2023/wordml/word16du" xmlns:wne="http://schemas.microsoft.com/office/word/2006/wordml" mc:Ignorable="w14 w15 w16se w16cid w16 w16cex w16sdtdh w16sdtfl w16du wp14">
   <w:p>
     <w:pPr>
       <w:pStyle w:val="Voettekst"/>
@@ -8670,7 +10112,7 @@
 </file>
 
 <file path=word/footnotes.xml><?xml version="1.0" encoding="utf-8"?>
-<w:footnotes xmlns:wpc="http://schemas.microsoft.com/office/word/2010/wordprocessingCanvas" xmlns:cx="http://schemas.microsoft.com/office/drawing/2014/chartex" xmlns:cx1="http://schemas.microsoft.com/office/drawing/2015/9/8/chartex" xmlns:cx2="http://schemas.microsoft.com/office/drawing/2015/10/21/chartex" xmlns:cx3="http://schemas.microsoft.com/office/drawing/2016/5/9/chartex" xmlns:cx4="http://schemas.microsoft.com/office/drawing/2016/5/10/chartex" xmlns:cx5="http://schemas.microsoft.com/office/drawing/2016/5/11/chartex" xmlns:cx6="http://schemas.microsoft.com/office/drawing/2016/5/12/chartex" xmlns:cx7="http://schemas.microsoft.com/office/drawing/2016/5/13/chartex" xmlns:cx8="http://schemas.microsoft.com/office/drawing/2016/5/14/chartex" xmlns:mc="http://schemas.openxmlformats.org/markup-compatibility/2006" xmlns:aink="http://schemas.microsoft.com/office/drawing/2016/ink" xmlns:am3d="http://schemas.microsoft.com/office/drawing/2017/model3d" xmlns:o="urn:schemas-microsoft-com:office:office" xmlns:oel="http://schemas.microsoft.com/office/2019/extlst" xmlns:r="http://schemas.openxmlformats.org/officeDocument/2006/relationships" xmlns:m="http://schemas.openxmlformats.org/officeDocument/2006/math" xmlns:v="urn:schemas-microsoft-com:vml" xmlns:wp14="http://schemas.microsoft.com/office/word/2010/wordprocessingDrawing" xmlns:wp="http://schemas.openxmlformats.org/drawingml/2006/wordprocessingDrawing" xmlns:w10="urn:schemas-microsoft-com:office:word" xmlns:w="http://schemas.openxmlformats.org/wordprocessingml/2006/main" xmlns:w14="http://schemas.microsoft.com/office/word/2010/wordml" xmlns:w15="http://schemas.microsoft.com/office/word/2012/wordml" xmlns:w16cex="http://schemas.microsoft.com/office/word/2018/wordml/cex" xmlns:w16cid="http://schemas.microsoft.com/office/word/2016/wordml/cid" xmlns:w16="http://schemas.microsoft.com/office/word/2018/wordml" xmlns:w16du="http://schemas.microsoft.com/office/word/2023/wordml/word16du" xmlns:w16sdtdh="http://schemas.microsoft.com/office/word/2020/wordml/sdtdatahash" xmlns:w16sdtfl="http://schemas.microsoft.com/office/word/2024/wordml/sdtformatlock" xmlns:w16se="http://schemas.microsoft.com/office/word/2015/wordml/symex" xmlns:wpg="http://schemas.microsoft.com/office/word/2010/wordprocessingGroup" xmlns:wpi="http://schemas.microsoft.com/office/word/2010/wordprocessingInk" xmlns:wne="http://schemas.microsoft.com/office/word/2006/wordml" xmlns:wps="http://schemas.microsoft.com/office/word/2010/wordprocessingShape" mc:Ignorable="w14 w15 w16se w16cid w16 w16cex w16sdtdh w16sdtfl w16du wp14">
+<w:footnotes xmlns:wpc="http://schemas.microsoft.com/office/word/2010/wordprocessingCanvas" xmlns:cx="http://schemas.microsoft.com/office/drawing/2014/chartex" xmlns:cx1="http://schemas.microsoft.com/office/drawing/2015/9/8/chartex" xmlns:cx2="http://schemas.microsoft.com/office/drawing/2015/10/21/chartex" xmlns:cx3="http://schemas.microsoft.com/office/drawing/2016/5/9/chartex" xmlns:cx4="http://schemas.microsoft.com/office/drawing/2016/5/10/chartex" xmlns:cx5="http://schemas.microsoft.com/office/drawing/2016/5/11/chartex" xmlns:cx6="http://schemas.microsoft.com/office/drawing/2016/5/12/chartex" xmlns:cx7="http://schemas.microsoft.com/office/drawing/2016/5/13/chartex" xmlns:cx8="http://schemas.microsoft.com/office/drawing/2016/5/14/chartex" xmlns:mc="http://schemas.openxmlformats.org/markup-compatibility/2006" xmlns:m="http://schemas.openxmlformats.org/officeDocument/2006/math" xmlns:aink="http://schemas.microsoft.com/office/drawing/2016/ink" xmlns:am3d="http://schemas.microsoft.com/office/drawing/2017/model3d" xmlns:oel="http://schemas.microsoft.com/office/2019/extlst" xmlns:r="http://schemas.openxmlformats.org/officeDocument/2006/relationships" xmlns:wp14="http://schemas.microsoft.com/office/word/2010/wordprocessingDrawing" xmlns:wp="http://schemas.openxmlformats.org/drawingml/2006/wordprocessingDrawing" xmlns:wpg="http://schemas.microsoft.com/office/word/2010/wordprocessingGroup" xmlns:wpi="http://schemas.microsoft.com/office/word/2010/wordprocessingInk" xmlns:wps="http://schemas.microsoft.com/office/word/2010/wordprocessingShape" xmlns:o="urn:schemas-microsoft-com:office:office" xmlns:v="urn:schemas-microsoft-com:vml" xmlns:w10="urn:schemas-microsoft-com:office:word" xmlns:w="http://schemas.openxmlformats.org/wordprocessingml/2006/main" xmlns:w14="http://schemas.microsoft.com/office/word/2010/wordml" xmlns:w15="http://schemas.microsoft.com/office/word/2012/wordml" xmlns:w16cei="http://schemas.microsoft.com/office/word/2026/wordml/cei" xmlns:w16cex="http://schemas.microsoft.com/office/word/2018/wordml/cex" xmlns:w16cid="http://schemas.microsoft.com/office/word/2016/wordml/cid" xmlns:w16="http://schemas.microsoft.com/office/word/2018/wordml" xmlns:w16sdtdh="http://schemas.microsoft.com/office/word/2020/wordml/sdtdatahash" xmlns:w16sdtfl="http://schemas.microsoft.com/office/word/2024/wordml/sdtformatlock" xmlns:w16se="http://schemas.microsoft.com/office/word/2015/wordml/symex" xmlns:w16du="http://schemas.microsoft.com/office/word/2023/wordml/word16du" xmlns:wne="http://schemas.microsoft.com/office/word/2006/wordml" mc:Ignorable="w14 w15 w16se w16cid w16 w16cex w16sdtdh w16sdtfl w16du wp14">
   <w:footnote w:type="separator" w:id="-1">
     <w:p>
       <w:pPr>
@@ -8695,7 +10137,7 @@
 </file>
 
 <file path=word/header1.xml><?xml version="1.0" encoding="utf-8"?>
-<w:hdr xmlns:wpc="http://schemas.microsoft.com/office/word/2010/wordprocessingCanvas" xmlns:cx="http://schemas.microsoft.com/office/drawing/2014/chartex" xmlns:cx1="http://schemas.microsoft.com/office/drawing/2015/9/8/chartex" xmlns:cx2="http://schemas.microsoft.com/office/drawing/2015/10/21/chartex" xmlns:cx3="http://schemas.microsoft.com/office/drawing/2016/5/9/chartex" xmlns:cx4="http://schemas.microsoft.com/office/drawing/2016/5/10/chartex" xmlns:cx5="http://schemas.microsoft.com/office/drawing/2016/5/11/chartex" xmlns:cx6="http://schemas.microsoft.com/office/drawing/2016/5/12/chartex" xmlns:cx7="http://schemas.microsoft.com/office/drawing/2016/5/13/chartex" xmlns:cx8="http://schemas.microsoft.com/office/drawing/2016/5/14/chartex" xmlns:mc="http://schemas.openxmlformats.org/markup-compatibility/2006" xmlns:aink="http://schemas.microsoft.com/office/drawing/2016/ink" xmlns:am3d="http://schemas.microsoft.com/office/drawing/2017/model3d" xmlns:o="urn:schemas-microsoft-com:office:office" xmlns:oel="http://schemas.microsoft.com/office/2019/extlst" xmlns:r="http://schemas.openxmlformats.org/officeDocument/2006/relationships" xmlns:m="http://schemas.openxmlformats.org/officeDocument/2006/math" xmlns:v="urn:schemas-microsoft-com:vml" xmlns:wp14="http://schemas.microsoft.com/office/word/2010/wordprocessingDrawing" xmlns:wp="http://schemas.openxmlformats.org/drawingml/2006/wordprocessingDrawing" xmlns:w10="urn:schemas-microsoft-com:office:word" xmlns:w="http://schemas.openxmlformats.org/wordprocessingml/2006/main" xmlns:w14="http://schemas.microsoft.com/office/word/2010/wordml" xmlns:w15="http://schemas.microsoft.com/office/word/2012/wordml" xmlns:w16cex="http://schemas.microsoft.com/office/word/2018/wordml/cex" xmlns:w16cid="http://schemas.microsoft.com/office/word/2016/wordml/cid" xmlns:w16="http://schemas.microsoft.com/office/word/2018/wordml" xmlns:w16du="http://schemas.microsoft.com/office/word/2023/wordml/word16du" xmlns:w16sdtdh="http://schemas.microsoft.com/office/word/2020/wordml/sdtdatahash" xmlns:w16sdtfl="http://schemas.microsoft.com/office/word/2024/wordml/sdtformatlock" xmlns:w16se="http://schemas.microsoft.com/office/word/2015/wordml/symex" xmlns:wpg="http://schemas.microsoft.com/office/word/2010/wordprocessingGroup" xmlns:wpi="http://schemas.microsoft.com/office/word/2010/wordprocessingInk" xmlns:wne="http://schemas.microsoft.com/office/word/2006/wordml" xmlns:wps="http://schemas.microsoft.com/office/word/2010/wordprocessingShape" mc:Ignorable="w14 w15 w16se w16cid w16 w16cex w16sdtdh w16sdtfl w16du wp14">
+<w:hdr xmlns:wpc="http://schemas.microsoft.com/office/word/2010/wordprocessingCanvas" xmlns:cx="http://schemas.microsoft.com/office/drawing/2014/chartex" xmlns:cx1="http://schemas.microsoft.com/office/drawing/2015/9/8/chartex" xmlns:cx2="http://schemas.microsoft.com/office/drawing/2015/10/21/chartex" xmlns:cx3="http://schemas.microsoft.com/office/drawing/2016/5/9/chartex" xmlns:cx4="http://schemas.microsoft.com/office/drawing/2016/5/10/chartex" xmlns:cx5="http://schemas.microsoft.com/office/drawing/2016/5/11/chartex" xmlns:cx6="http://schemas.microsoft.com/office/drawing/2016/5/12/chartex" xmlns:cx7="http://schemas.microsoft.com/office/drawing/2016/5/13/chartex" xmlns:cx8="http://schemas.microsoft.com/office/drawing/2016/5/14/chartex" xmlns:mc="http://schemas.openxmlformats.org/markup-compatibility/2006" xmlns:m="http://schemas.openxmlformats.org/officeDocument/2006/math" xmlns:aink="http://schemas.microsoft.com/office/drawing/2016/ink" xmlns:am3d="http://schemas.microsoft.com/office/drawing/2017/model3d" xmlns:oel="http://schemas.microsoft.com/office/2019/extlst" xmlns:r="http://schemas.openxmlformats.org/officeDocument/2006/relationships" xmlns:wp14="http://schemas.microsoft.com/office/word/2010/wordprocessingDrawing" xmlns:wp="http://schemas.openxmlformats.org/drawingml/2006/wordprocessingDrawing" xmlns:wpg="http://schemas.microsoft.com/office/word/2010/wordprocessingGroup" xmlns:wpi="http://schemas.microsoft.com/office/word/2010/wordprocessingInk" xmlns:wps="http://schemas.microsoft.com/office/word/2010/wordprocessingShape" xmlns:o="urn:schemas-microsoft-com:office:office" xmlns:v="urn:schemas-microsoft-com:vml" xmlns:w10="urn:schemas-microsoft-com:office:word" xmlns:w="http://schemas.openxmlformats.org/wordprocessingml/2006/main" xmlns:w14="http://schemas.microsoft.com/office/word/2010/wordml" xmlns:w15="http://schemas.microsoft.com/office/word/2012/wordml" xmlns:w16cei="http://schemas.microsoft.com/office/word/2026/wordml/cei" xmlns:w16cex="http://schemas.microsoft.com/office/word/2018/wordml/cex" xmlns:w16cid="http://schemas.microsoft.com/office/word/2016/wordml/cid" xmlns:w16="http://schemas.microsoft.com/office/word/2018/wordml" xmlns:w16sdtdh="http://schemas.microsoft.com/office/word/2020/wordml/sdtdatahash" xmlns:w16sdtfl="http://schemas.microsoft.com/office/word/2024/wordml/sdtformatlock" xmlns:w16se="http://schemas.microsoft.com/office/word/2015/wordml/symex" xmlns:w16du="http://schemas.microsoft.com/office/word/2023/wordml/word16du" xmlns:wne="http://schemas.microsoft.com/office/word/2006/wordml" mc:Ignorable="w14 w15 w16se w16cid w16 w16cex w16sdtdh w16sdtfl w16du wp14">
   <w:p>
     <w:pPr>
       <w:pStyle w:val="Koptekst"/>
@@ -8732,7 +10174,7 @@
 </file>
 
 <file path=word/header2.xml><?xml version="1.0" encoding="utf-8"?>
-<w:hdr xmlns:wpc="http://schemas.microsoft.com/office/word/2010/wordprocessingCanvas" xmlns:cx="http://schemas.microsoft.com/office/drawing/2014/chartex" xmlns:cx1="http://schemas.microsoft.com/office/drawing/2015/9/8/chartex" xmlns:cx2="http://schemas.microsoft.com/office/drawing/2015/10/21/chartex" xmlns:cx3="http://schemas.microsoft.com/office/drawing/2016/5/9/chartex" xmlns:cx4="http://schemas.microsoft.com/office/drawing/2016/5/10/chartex" xmlns:cx5="http://schemas.microsoft.com/office/drawing/2016/5/11/chartex" xmlns:cx6="http://schemas.microsoft.com/office/drawing/2016/5/12/chartex" xmlns:cx7="http://schemas.microsoft.com/office/drawing/2016/5/13/chartex" xmlns:cx8="http://schemas.microsoft.com/office/drawing/2016/5/14/chartex" xmlns:mc="http://schemas.openxmlformats.org/markup-compatibility/2006" xmlns:aink="http://schemas.microsoft.com/office/drawing/2016/ink" xmlns:am3d="http://schemas.microsoft.com/office/drawing/2017/model3d" xmlns:o="urn:schemas-microsoft-com:office:office" xmlns:oel="http://schemas.microsoft.com/office/2019/extlst" xmlns:r="http://schemas.openxmlformats.org/officeDocument/2006/relationships" xmlns:m="http://schemas.openxmlformats.org/officeDocument/2006/math" xmlns:v="urn:schemas-microsoft-com:vml" xmlns:wp14="http://schemas.microsoft.com/office/word/2010/wordprocessingDrawing" xmlns:wp="http://schemas.openxmlformats.org/drawingml/2006/wordprocessingDrawing" xmlns:w10="urn:schemas-microsoft-com:office:word" xmlns:w="http://schemas.openxmlformats.org/wordprocessingml/2006/main" xmlns:w14="http://schemas.microsoft.com/office/word/2010/wordml" xmlns:w15="http://schemas.microsoft.com/office/word/2012/wordml" xmlns:w16cex="http://schemas.microsoft.com/office/word/2018/wordml/cex" xmlns:w16cid="http://schemas.microsoft.com/office/word/2016/wordml/cid" xmlns:w16="http://schemas.microsoft.com/office/word/2018/wordml" xmlns:w16du="http://schemas.microsoft.com/office/word/2023/wordml/word16du" xmlns:w16sdtdh="http://schemas.microsoft.com/office/word/2020/wordml/sdtdatahash" xmlns:w16sdtfl="http://schemas.microsoft.com/office/word/2024/wordml/sdtformatlock" xmlns:w16se="http://schemas.microsoft.com/office/word/2015/wordml/symex" xmlns:wpg="http://schemas.microsoft.com/office/word/2010/wordprocessingGroup" xmlns:wpi="http://schemas.microsoft.com/office/word/2010/wordprocessingInk" xmlns:wne="http://schemas.microsoft.com/office/word/2006/wordml" xmlns:wps="http://schemas.microsoft.com/office/word/2010/wordprocessingShape" mc:Ignorable="w14 w15 w16se w16cid w16 w16cex w16sdtdh w16sdtfl w16du wp14">
+<w:hdr xmlns:wpc="http://schemas.microsoft.com/office/word/2010/wordprocessingCanvas" xmlns:cx="http://schemas.microsoft.com/office/drawing/2014/chartex" xmlns:cx1="http://schemas.microsoft.com/office/drawing/2015/9/8/chartex" xmlns:cx2="http://schemas.microsoft.com/office/drawing/2015/10/21/chartex" xmlns:cx3="http://schemas.microsoft.com/office/drawing/2016/5/9/chartex" xmlns:cx4="http://schemas.microsoft.com/office/drawing/2016/5/10/chartex" xmlns:cx5="http://schemas.microsoft.com/office/drawing/2016/5/11/chartex" xmlns:cx6="http://schemas.microsoft.com/office/drawing/2016/5/12/chartex" xmlns:cx7="http://schemas.microsoft.com/office/drawing/2016/5/13/chartex" xmlns:cx8="http://schemas.microsoft.com/office/drawing/2016/5/14/chartex" xmlns:mc="http://schemas.openxmlformats.org/markup-compatibility/2006" xmlns:m="http://schemas.openxmlformats.org/officeDocument/2006/math" xmlns:aink="http://schemas.microsoft.com/office/drawing/2016/ink" xmlns:am3d="http://schemas.microsoft.com/office/drawing/2017/model3d" xmlns:oel="http://schemas.microsoft.com/office/2019/extlst" xmlns:r="http://schemas.openxmlformats.org/officeDocument/2006/relationships" xmlns:wp14="http://schemas.microsoft.com/office/word/2010/wordprocessingDrawing" xmlns:wp="http://schemas.openxmlformats.org/drawingml/2006/wordprocessingDrawing" xmlns:wpg="http://schemas.microsoft.com/office/word/2010/wordprocessingGroup" xmlns:wpi="http://schemas.microsoft.com/office/word/2010/wordprocessingInk" xmlns:wps="http://schemas.microsoft.com/office/word/2010/wordprocessingShape" xmlns:o="urn:schemas-microsoft-com:office:office" xmlns:v="urn:schemas-microsoft-com:vml" xmlns:w10="urn:schemas-microsoft-com:office:word" xmlns:w="http://schemas.openxmlformats.org/wordprocessingml/2006/main" xmlns:w14="http://schemas.microsoft.com/office/word/2010/wordml" xmlns:w15="http://schemas.microsoft.com/office/word/2012/wordml" xmlns:w16cei="http://schemas.microsoft.com/office/word/2026/wordml/cei" xmlns:w16cex="http://schemas.microsoft.com/office/word/2018/wordml/cex" xmlns:w16cid="http://schemas.microsoft.com/office/word/2016/wordml/cid" xmlns:w16="http://schemas.microsoft.com/office/word/2018/wordml" xmlns:w16sdtdh="http://schemas.microsoft.com/office/word/2020/wordml/sdtdatahash" xmlns:w16sdtfl="http://schemas.microsoft.com/office/word/2024/wordml/sdtformatlock" xmlns:w16se="http://schemas.microsoft.com/office/word/2015/wordml/symex" xmlns:w16du="http://schemas.microsoft.com/office/word/2023/wordml/word16du" xmlns:wne="http://schemas.microsoft.com/office/word/2006/wordml" mc:Ignorable="w14 w15 w16se w16cid w16 w16cex w16sdtdh w16sdtfl w16du wp14">
   <w:p>
     <w:pPr>
       <w:pStyle w:val="Koptekst"/>
@@ -8792,7 +10234,7 @@
 </file>
 
 <file path=word/styles.xml><?xml version="1.0" encoding="utf-8"?>
-<w:styles xmlns:mc="http://schemas.openxmlformats.org/markup-compatibility/2006" xmlns:r="http://schemas.openxmlformats.org/officeDocument/2006/relationships" xmlns:w="http://schemas.openxmlformats.org/wordprocessingml/2006/main" xmlns:w14="http://schemas.microsoft.com/office/word/2010/wordml" xmlns:w15="http://schemas.microsoft.com/office/word/2012/wordml" xmlns:w16cex="http://schemas.microsoft.com/office/word/2018/wordml/cex" xmlns:w16cid="http://schemas.microsoft.com/office/word/2016/wordml/cid" xmlns:w16="http://schemas.microsoft.com/office/word/2018/wordml" xmlns:w16du="http://schemas.microsoft.com/office/word/2023/wordml/word16du" xmlns:w16sdtdh="http://schemas.microsoft.com/office/word/2020/wordml/sdtdatahash" xmlns:w16sdtfl="http://schemas.microsoft.com/office/word/2024/wordml/sdtformatlock" xmlns:w16se="http://schemas.microsoft.com/office/word/2015/wordml/symex" mc:Ignorable="w14 w15 w16se w16cid w16 w16cex w16sdtdh w16sdtfl w16du">
+<w:styles xmlns:mc="http://schemas.openxmlformats.org/markup-compatibility/2006" xmlns:r="http://schemas.openxmlformats.org/officeDocument/2006/relationships" xmlns:w="http://schemas.openxmlformats.org/wordprocessingml/2006/main" xmlns:w14="http://schemas.microsoft.com/office/word/2010/wordml" xmlns:w15="http://schemas.microsoft.com/office/word/2012/wordml" xmlns:w16cex="http://schemas.microsoft.com/office/word/2018/wordml/cex" xmlns:w16cid="http://schemas.microsoft.com/office/word/2016/wordml/cid" xmlns:w16="http://schemas.microsoft.com/office/word/2018/wordml" xmlns:w16sdtdh="http://schemas.microsoft.com/office/word/2020/wordml/sdtdatahash" xmlns:w16sdtfl="http://schemas.microsoft.com/office/word/2024/wordml/sdtformatlock" xmlns:w16se="http://schemas.microsoft.com/office/word/2015/wordml/symex" xmlns:w16du="http://schemas.microsoft.com/office/word/2023/wordml/word16du" mc:Ignorable="w14 w15 w16se w16cid w16 w16cex w16sdtdh w16sdtfl w16du">
   <w:docDefaults>
     <w:rPrDefault>
       <w:rPr>

</xml_diff>